<commit_message>
update noi dung chuong 2
</commit_message>
<xml_diff>
--- a/Chat_report/Chat_report.docx
+++ b/Chat_report/Chat_report.docx
@@ -567,7 +567,7 @@
         </w:rPr>
         <w:tab/>
       </w:r>
-      <w:bookmarkStart w:id="0" w:name="_Toc232624489"/>
+      <w:bookmarkStart w:id="0" w:name="_Toc232625625"/>
       <w:r>
         <w:rPr>
           <w:sz w:val="30"/>
@@ -864,7 +864,7 @@
         </w:rPr>
         <w:tab/>
       </w:r>
-      <w:bookmarkStart w:id="1" w:name="_Toc232624490"/>
+      <w:bookmarkStart w:id="1" w:name="_Toc232625626"/>
       <w:r>
         <w:rPr>
           <w:sz w:val="32"/>
@@ -1137,7 +1137,7 @@
           <w:lang w:val="en-US"/>
         </w:rPr>
       </w:pPr>
-      <w:bookmarkStart w:id="2" w:name="_Toc232624491"/>
+      <w:bookmarkStart w:id="2" w:name="_Toc232625627"/>
       <w:r>
         <w:rPr>
           <w:sz w:val="26"/>
@@ -1265,7 +1265,7 @@
           <w:szCs w:val="32"/>
         </w:rPr>
       </w:pPr>
-      <w:bookmarkStart w:id="3" w:name="_Toc232624492"/>
+      <w:bookmarkStart w:id="3" w:name="_Toc232625628"/>
       <w:r>
         <w:rPr>
           <w:sz w:val="32"/>
@@ -1545,7 +1545,7 @@
         </w:rPr>
         <w:br w:type="page"/>
       </w:r>
-      <w:bookmarkStart w:id="4" w:name="_Toc232624493"/>
+      <w:bookmarkStart w:id="4" w:name="_Toc232625629"/>
       <w:r>
         <w:rPr>
           <w:sz w:val="26"/>
@@ -1590,7 +1590,7 @@
         </w:rPr>
         <w:fldChar w:fldCharType="separate"/>
       </w:r>
-      <w:hyperlink w:anchor="_Toc232624489" w:history="1">
+      <w:hyperlink w:anchor="_Toc232625625" w:history="1">
         <w:r>
           <w:rPr>
             <w:rStyle w:val="Hyperlink"/>
@@ -1618,7 +1618,7 @@
             <w:noProof/>
             <w:webHidden/>
           </w:rPr>
-          <w:instrText xml:space="preserve"> PAGEREF _Toc232624489 \h </w:instrText>
+          <w:instrText xml:space="preserve"> PAGEREF _Toc232625625 \h </w:instrText>
         </w:r>
         <w:r>
           <w:rPr>
@@ -1661,7 +1661,7 @@
           <w:lang w:val="en-US"/>
         </w:rPr>
       </w:pPr>
-      <w:hyperlink w:anchor="_Toc232624490" w:history="1">
+      <w:hyperlink w:anchor="_Toc232625626" w:history="1">
         <w:r>
           <w:rPr>
             <w:rStyle w:val="Hyperlink"/>
@@ -1688,7 +1688,7 @@
             <w:noProof/>
             <w:webHidden/>
           </w:rPr>
-          <w:instrText xml:space="preserve"> PAGEREF _Toc232624490 \h </w:instrText>
+          <w:instrText xml:space="preserve"> PAGEREF _Toc232625626 \h </w:instrText>
         </w:r>
         <w:r>
           <w:rPr>
@@ -1731,7 +1731,7 @@
           <w:lang w:val="en-US"/>
         </w:rPr>
       </w:pPr>
-      <w:hyperlink w:anchor="_Toc232624491" w:history="1">
+      <w:hyperlink w:anchor="_Toc232625627" w:history="1">
         <w:r>
           <w:rPr>
             <w:rStyle w:val="Hyperlink"/>
@@ -1766,7 +1766,7 @@
             <w:noProof/>
             <w:webHidden/>
           </w:rPr>
-          <w:instrText xml:space="preserve"> PAGEREF _Toc232624491 \h </w:instrText>
+          <w:instrText xml:space="preserve"> PAGEREF _Toc232625627 \h </w:instrText>
         </w:r>
         <w:r>
           <w:rPr>
@@ -1809,7 +1809,7 @@
           <w:lang w:val="en-US"/>
         </w:rPr>
       </w:pPr>
-      <w:hyperlink w:anchor="_Toc232624492" w:history="1">
+      <w:hyperlink w:anchor="_Toc232625628" w:history="1">
         <w:r>
           <w:rPr>
             <w:rStyle w:val="Hyperlink"/>
@@ -1851,7 +1851,7 @@
             <w:noProof/>
             <w:webHidden/>
           </w:rPr>
-          <w:instrText xml:space="preserve"> PAGEREF _Toc232624492 \h </w:instrText>
+          <w:instrText xml:space="preserve"> PAGEREF _Toc232625628 \h </w:instrText>
         </w:r>
         <w:r>
           <w:rPr>
@@ -1894,7 +1894,7 @@
           <w:lang w:val="en-US"/>
         </w:rPr>
       </w:pPr>
-      <w:hyperlink w:anchor="_Toc232624493" w:history="1">
+      <w:hyperlink w:anchor="_Toc232625629" w:history="1">
         <w:r>
           <w:rPr>
             <w:rStyle w:val="Hyperlink"/>
@@ -1922,7 +1922,7 @@
             <w:noProof/>
             <w:webHidden/>
           </w:rPr>
-          <w:instrText xml:space="preserve"> PAGEREF _Toc232624493 \h </w:instrText>
+          <w:instrText xml:space="preserve"> PAGEREF _Toc232625629 \h </w:instrText>
         </w:r>
         <w:r>
           <w:rPr>
@@ -1965,7 +1965,7 @@
           <w:lang w:val="en-US"/>
         </w:rPr>
       </w:pPr>
-      <w:hyperlink w:anchor="_Toc232624494" w:history="1">
+      <w:hyperlink w:anchor="_Toc232625630" w:history="1">
         <w:r>
           <w:rPr>
             <w:rStyle w:val="Hyperlink"/>
@@ -1993,7 +1993,7 @@
             <w:noProof/>
             <w:webHidden/>
           </w:rPr>
-          <w:instrText xml:space="preserve"> PAGEREF _Toc232624494 \h </w:instrText>
+          <w:instrText xml:space="preserve"> PAGEREF _Toc232625630 \h </w:instrText>
         </w:r>
         <w:r>
           <w:rPr>
@@ -2036,7 +2036,7 @@
           <w:lang w:val="en-US"/>
         </w:rPr>
       </w:pPr>
-      <w:hyperlink w:anchor="_Toc232624495" w:history="1">
+      <w:hyperlink w:anchor="_Toc232625631" w:history="1">
         <w:r>
           <w:rPr>
             <w:rStyle w:val="Hyperlink"/>
@@ -2064,7 +2064,7 @@
             <w:noProof/>
             <w:webHidden/>
           </w:rPr>
-          <w:instrText xml:space="preserve"> PAGEREF _Toc232624495 \h </w:instrText>
+          <w:instrText xml:space="preserve"> PAGEREF _Toc232625631 \h </w:instrText>
         </w:r>
         <w:r>
           <w:rPr>
@@ -2107,7 +2107,7 @@
           <w:lang w:val="en-US"/>
         </w:rPr>
       </w:pPr>
-      <w:hyperlink w:anchor="_Toc232624496" w:history="1">
+      <w:hyperlink w:anchor="_Toc232625632" w:history="1">
         <w:r>
           <w:rPr>
             <w:rStyle w:val="Hyperlink"/>
@@ -2134,7 +2134,7 @@
             <w:noProof/>
             <w:webHidden/>
           </w:rPr>
-          <w:instrText xml:space="preserve"> PAGEREF _Toc232624496 \h </w:instrText>
+          <w:instrText xml:space="preserve"> PAGEREF _Toc232625632 \h </w:instrText>
         </w:r>
         <w:r>
           <w:rPr>
@@ -2177,7 +2177,7 @@
           <w:lang w:val="en-US"/>
         </w:rPr>
       </w:pPr>
-      <w:hyperlink w:anchor="_Toc232624497" w:history="1">
+      <w:hyperlink w:anchor="_Toc232625633" w:history="1">
         <w:r>
           <w:rPr>
             <w:rStyle w:val="Hyperlink"/>
@@ -2205,7 +2205,7 @@
             <w:noProof/>
             <w:webHidden/>
           </w:rPr>
-          <w:instrText xml:space="preserve"> PAGEREF _Toc232624497 \h </w:instrText>
+          <w:instrText xml:space="preserve"> PAGEREF _Toc232625633 \h </w:instrText>
         </w:r>
         <w:r>
           <w:rPr>
@@ -2248,7 +2248,7 @@
           <w:lang w:val="en-US"/>
         </w:rPr>
       </w:pPr>
-      <w:hyperlink w:anchor="_Toc232624498" w:history="1">
+      <w:hyperlink w:anchor="_Toc232625634" w:history="1">
         <w:r>
           <w:rPr>
             <w:rStyle w:val="Hyperlink"/>
@@ -2328,7 +2328,7 @@
             <w:noProof/>
             <w:webHidden/>
           </w:rPr>
-          <w:instrText xml:space="preserve"> PAGEREF _Toc232624498 \h </w:instrText>
+          <w:instrText xml:space="preserve"> PAGEREF _Toc232625634 \h </w:instrText>
         </w:r>
         <w:r>
           <w:rPr>
@@ -2372,7 +2372,7 @@
           <w:lang w:val="en-US"/>
         </w:rPr>
       </w:pPr>
-      <w:hyperlink w:anchor="_Toc232624499" w:history="1">
+      <w:hyperlink w:anchor="_Toc232625635" w:history="1">
         <w:r>
           <w:rPr>
             <w:rStyle w:val="Hyperlink"/>
@@ -2550,7 +2550,7 @@
             <w:noProof/>
             <w:webHidden/>
           </w:rPr>
-          <w:instrText xml:space="preserve"> PAGEREF _Toc232624499 \h </w:instrText>
+          <w:instrText xml:space="preserve"> PAGEREF _Toc232625635 \h </w:instrText>
         </w:r>
         <w:r>
           <w:rPr>
@@ -2594,7 +2594,7 @@
           <w:lang w:val="en-US"/>
         </w:rPr>
       </w:pPr>
-      <w:hyperlink w:anchor="_Toc232624500" w:history="1">
+      <w:hyperlink w:anchor="_Toc232625636" w:history="1">
         <w:r>
           <w:rPr>
             <w:rStyle w:val="Hyperlink"/>
@@ -2715,7 +2715,7 @@
             <w:noProof/>
             <w:webHidden/>
           </w:rPr>
-          <w:instrText xml:space="preserve"> PAGEREF _Toc232624500 \h </w:instrText>
+          <w:instrText xml:space="preserve"> PAGEREF _Toc232625636 \h </w:instrText>
         </w:r>
         <w:r>
           <w:rPr>
@@ -2758,7 +2758,7 @@
           <w:lang w:val="en-US"/>
         </w:rPr>
       </w:pPr>
-      <w:hyperlink w:anchor="_Toc232624501" w:history="1">
+      <w:hyperlink w:anchor="_Toc232625637" w:history="1">
         <w:r>
           <w:rPr>
             <w:rStyle w:val="Hyperlink"/>
@@ -2838,7 +2838,7 @@
             <w:noProof/>
             <w:webHidden/>
           </w:rPr>
-          <w:instrText xml:space="preserve"> PAGEREF _Toc232624501 \h </w:instrText>
+          <w:instrText xml:space="preserve"> PAGEREF _Toc232625637 \h </w:instrText>
         </w:r>
         <w:r>
           <w:rPr>
@@ -2881,7 +2881,7 @@
           <w:lang w:val="en-US"/>
         </w:rPr>
       </w:pPr>
-      <w:hyperlink w:anchor="_Toc232624502" w:history="1">
+      <w:hyperlink w:anchor="_Toc232625638" w:history="1">
         <w:r>
           <w:rPr>
             <w:rStyle w:val="Hyperlink"/>
@@ -2916,7 +2916,7 @@
             <w:noProof/>
             <w:webHidden/>
           </w:rPr>
-          <w:instrText xml:space="preserve"> PAGEREF _Toc232624502 \h </w:instrText>
+          <w:instrText xml:space="preserve"> PAGEREF _Toc232625638 \h </w:instrText>
         </w:r>
         <w:r>
           <w:rPr>
@@ -2960,7 +2960,7 @@
           <w:lang w:val="en-US"/>
         </w:rPr>
       </w:pPr>
-      <w:hyperlink w:anchor="_Toc232624503" w:history="1">
+      <w:hyperlink w:anchor="_Toc232625639" w:history="1">
         <w:r>
           <w:rPr>
             <w:rStyle w:val="Hyperlink"/>
@@ -3119,7 +3119,7 @@
             <w:noProof/>
             <w:webHidden/>
           </w:rPr>
-          <w:instrText xml:space="preserve"> PAGEREF _Toc232624503 \h </w:instrText>
+          <w:instrText xml:space="preserve"> PAGEREF _Toc232625639 \h </w:instrText>
         </w:r>
         <w:r>
           <w:rPr>
@@ -3162,7 +3162,7 @@
           <w:lang w:val="en-US"/>
         </w:rPr>
       </w:pPr>
-      <w:hyperlink w:anchor="_Toc232624504" w:history="1">
+      <w:hyperlink w:anchor="_Toc232625640" w:history="1">
         <w:r>
           <w:rPr>
             <w:rStyle w:val="Hyperlink"/>
@@ -3189,7 +3189,7 @@
             <w:noProof/>
             <w:webHidden/>
           </w:rPr>
-          <w:instrText xml:space="preserve"> PAGEREF _Toc232624504 \h </w:instrText>
+          <w:instrText xml:space="preserve"> PAGEREF _Toc232625640 \h </w:instrText>
         </w:r>
         <w:r>
           <w:rPr>
@@ -3232,7 +3232,7 @@
           <w:lang w:val="en-US"/>
         </w:rPr>
       </w:pPr>
-      <w:hyperlink w:anchor="_Toc232624505" w:history="1">
+      <w:hyperlink w:anchor="_Toc232625641" w:history="1">
         <w:r>
           <w:rPr>
             <w:rStyle w:val="Hyperlink"/>
@@ -3259,7 +3259,7 @@
             <w:noProof/>
             <w:webHidden/>
           </w:rPr>
-          <w:instrText xml:space="preserve"> PAGEREF _Toc232624505 \h </w:instrText>
+          <w:instrText xml:space="preserve"> PAGEREF _Toc232625641 \h </w:instrText>
         </w:r>
         <w:r>
           <w:rPr>
@@ -3302,7 +3302,7 @@
           <w:lang w:val="en-US"/>
         </w:rPr>
       </w:pPr>
-      <w:hyperlink w:anchor="_Toc232624506" w:history="1">
+      <w:hyperlink w:anchor="_Toc232625642" w:history="1">
         <w:r>
           <w:rPr>
             <w:rStyle w:val="Hyperlink"/>
@@ -3329,7 +3329,7 @@
             <w:noProof/>
             <w:webHidden/>
           </w:rPr>
-          <w:instrText xml:space="preserve"> PAGEREF _Toc232624506 \h </w:instrText>
+          <w:instrText xml:space="preserve"> PAGEREF _Toc232625642 \h </w:instrText>
         </w:r>
         <w:r>
           <w:rPr>
@@ -3372,7 +3372,7 @@
           <w:lang w:val="en-US"/>
         </w:rPr>
       </w:pPr>
-      <w:hyperlink w:anchor="_Toc232624507" w:history="1">
+      <w:hyperlink w:anchor="_Toc232625643" w:history="1">
         <w:r>
           <w:rPr>
             <w:rStyle w:val="Hyperlink"/>
@@ -3399,7 +3399,7 @@
             <w:noProof/>
             <w:webHidden/>
           </w:rPr>
-          <w:instrText xml:space="preserve"> PAGEREF _Toc232624507 \h </w:instrText>
+          <w:instrText xml:space="preserve"> PAGEREF _Toc232625643 \h </w:instrText>
         </w:r>
         <w:r>
           <w:rPr>
@@ -3442,7 +3442,7 @@
           <w:lang w:val="en-US"/>
         </w:rPr>
       </w:pPr>
-      <w:hyperlink w:anchor="_Toc232624508" w:history="1">
+      <w:hyperlink w:anchor="_Toc232625644" w:history="1">
         <w:r>
           <w:rPr>
             <w:rStyle w:val="Hyperlink"/>
@@ -3470,7 +3470,7 @@
             <w:noProof/>
             <w:webHidden/>
           </w:rPr>
-          <w:instrText xml:space="preserve"> PAGEREF _Toc232624508 \h </w:instrText>
+          <w:instrText xml:space="preserve"> PAGEREF _Toc232625644 \h </w:instrText>
         </w:r>
         <w:r>
           <w:rPr>
@@ -3513,7 +3513,7 @@
           <w:lang w:val="en-US"/>
         </w:rPr>
       </w:pPr>
-      <w:hyperlink w:anchor="_Toc232624509" w:history="1">
+      <w:hyperlink w:anchor="_Toc232625645" w:history="1">
         <w:r>
           <w:rPr>
             <w:rStyle w:val="Hyperlink"/>
@@ -3541,7 +3541,7 @@
             <w:noProof/>
             <w:webHidden/>
           </w:rPr>
-          <w:instrText xml:space="preserve"> PAGEREF _Toc232624509 \h </w:instrText>
+          <w:instrText xml:space="preserve"> PAGEREF _Toc232625645 \h </w:instrText>
         </w:r>
         <w:r>
           <w:rPr>
@@ -3584,7 +3584,7 @@
           <w:lang w:val="en-US"/>
         </w:rPr>
       </w:pPr>
-      <w:hyperlink w:anchor="_Toc232624510" w:history="1">
+      <w:hyperlink w:anchor="_Toc232625646" w:history="1">
         <w:r>
           <w:rPr>
             <w:rStyle w:val="Hyperlink"/>
@@ -3612,7 +3612,7 @@
             <w:noProof/>
             <w:webHidden/>
           </w:rPr>
-          <w:instrText xml:space="preserve"> PAGEREF _Toc232624510 \h </w:instrText>
+          <w:instrText xml:space="preserve"> PAGEREF _Toc232625646 \h </w:instrText>
         </w:r>
         <w:r>
           <w:rPr>
@@ -3655,7 +3655,7 @@
           <w:lang w:val="en-US"/>
         </w:rPr>
       </w:pPr>
-      <w:hyperlink w:anchor="_Toc232624511" w:history="1">
+      <w:hyperlink w:anchor="_Toc232625647" w:history="1">
         <w:r>
           <w:rPr>
             <w:rStyle w:val="Hyperlink"/>
@@ -3854,7 +3854,7 @@
             <w:noProof/>
             <w:webHidden/>
           </w:rPr>
-          <w:instrText xml:space="preserve"> PAGEREF _Toc232624511 \h </w:instrText>
+          <w:instrText xml:space="preserve"> PAGEREF _Toc232625647 \h </w:instrText>
         </w:r>
         <w:r>
           <w:rPr>
@@ -3898,7 +3898,7 @@
           <w:lang w:val="en-US"/>
         </w:rPr>
       </w:pPr>
-      <w:hyperlink w:anchor="_Toc232624512" w:history="1">
+      <w:hyperlink w:anchor="_Toc232625648" w:history="1">
         <w:r>
           <w:rPr>
             <w:rStyle w:val="Hyperlink"/>
@@ -4129,7 +4129,7 @@
             <w:noProof/>
             <w:webHidden/>
           </w:rPr>
-          <w:instrText xml:space="preserve"> PAGEREF _Toc232624512 \h </w:instrText>
+          <w:instrText xml:space="preserve"> PAGEREF _Toc232625648 \h </w:instrText>
         </w:r>
         <w:r>
           <w:rPr>
@@ -4173,7 +4173,7 @@
           <w:lang w:val="en-US"/>
         </w:rPr>
       </w:pPr>
-      <w:hyperlink w:anchor="_Toc232624513" w:history="1">
+      <w:hyperlink w:anchor="_Toc232625649" w:history="1">
         <w:r>
           <w:rPr>
             <w:rStyle w:val="Hyperlink"/>
@@ -4370,7 +4370,7 @@
             <w:noProof/>
             <w:webHidden/>
           </w:rPr>
-          <w:instrText xml:space="preserve"> PAGEREF _Toc232624513 \h </w:instrText>
+          <w:instrText xml:space="preserve"> PAGEREF _Toc232625649 \h </w:instrText>
         </w:r>
         <w:r>
           <w:rPr>
@@ -4414,7 +4414,7 @@
           <w:lang w:val="en-US"/>
         </w:rPr>
       </w:pPr>
-      <w:hyperlink w:anchor="_Toc232624514" w:history="1">
+      <w:hyperlink w:anchor="_Toc232625650" w:history="1">
         <w:r>
           <w:rPr>
             <w:rStyle w:val="Hyperlink"/>
@@ -4649,7 +4649,7 @@
             <w:noProof/>
             <w:webHidden/>
           </w:rPr>
-          <w:instrText xml:space="preserve"> PAGEREF _Toc232624514 \h </w:instrText>
+          <w:instrText xml:space="preserve"> PAGEREF _Toc232625650 \h </w:instrText>
         </w:r>
         <w:r>
           <w:rPr>
@@ -4693,7 +4693,7 @@
           <w:lang w:val="en-US"/>
         </w:rPr>
       </w:pPr>
-      <w:hyperlink w:anchor="_Toc232624515" w:history="1">
+      <w:hyperlink w:anchor="_Toc232625651" w:history="1">
         <w:r>
           <w:rPr>
             <w:rStyle w:val="Hyperlink"/>
@@ -4873,7 +4873,7 @@
             <w:noProof/>
             <w:webHidden/>
           </w:rPr>
-          <w:instrText xml:space="preserve"> PAGEREF _Toc232624515 \h </w:instrText>
+          <w:instrText xml:space="preserve"> PAGEREF _Toc232625651 \h </w:instrText>
         </w:r>
         <w:r>
           <w:rPr>
@@ -4917,7 +4917,7 @@
           <w:lang w:val="en-US"/>
         </w:rPr>
       </w:pPr>
-      <w:hyperlink w:anchor="_Toc232624516" w:history="1">
+      <w:hyperlink w:anchor="_Toc232625652" w:history="1">
         <w:r>
           <w:rPr>
             <w:rStyle w:val="Hyperlink"/>
@@ -4961,7 +4961,7 @@
             <w:noProof/>
             <w:webHidden/>
           </w:rPr>
-          <w:instrText xml:space="preserve"> PAGEREF _Toc232624516 \h </w:instrText>
+          <w:instrText xml:space="preserve"> PAGEREF _Toc232625652 \h </w:instrText>
         </w:r>
         <w:r>
           <w:rPr>
@@ -5005,7 +5005,7 @@
           <w:lang w:val="en-US"/>
         </w:rPr>
       </w:pPr>
-      <w:hyperlink w:anchor="_Toc232624517" w:history="1">
+      <w:hyperlink w:anchor="_Toc232625653" w:history="1">
         <w:r>
           <w:rPr>
             <w:rStyle w:val="Hyperlink"/>
@@ -5049,7 +5049,7 @@
             <w:noProof/>
             <w:webHidden/>
           </w:rPr>
-          <w:instrText xml:space="preserve"> PAGEREF _Toc232624517 \h </w:instrText>
+          <w:instrText xml:space="preserve"> PAGEREF _Toc232625653 \h </w:instrText>
         </w:r>
         <w:r>
           <w:rPr>
@@ -5093,7 +5093,7 @@
           <w:lang w:val="en-US"/>
         </w:rPr>
       </w:pPr>
-      <w:hyperlink w:anchor="_Toc232624518" w:history="1">
+      <w:hyperlink w:anchor="_Toc232625654" w:history="1">
         <w:r>
           <w:rPr>
             <w:rStyle w:val="Hyperlink"/>
@@ -5137,7 +5137,7 @@
             <w:noProof/>
             <w:webHidden/>
           </w:rPr>
-          <w:instrText xml:space="preserve"> PAGEREF _Toc232624518 \h </w:instrText>
+          <w:instrText xml:space="preserve"> PAGEREF _Toc232625654 \h </w:instrText>
         </w:r>
         <w:r>
           <w:rPr>
@@ -5181,7 +5181,7 @@
           <w:lang w:val="en-US"/>
         </w:rPr>
       </w:pPr>
-      <w:hyperlink w:anchor="_Toc232624519" w:history="1">
+      <w:hyperlink w:anchor="_Toc232625655" w:history="1">
         <w:r>
           <w:rPr>
             <w:rStyle w:val="Hyperlink"/>
@@ -5224,7 +5224,7 @@
             <w:noProof/>
             <w:webHidden/>
           </w:rPr>
-          <w:instrText xml:space="preserve"> PAGEREF _Toc232624519 \h </w:instrText>
+          <w:instrText xml:space="preserve"> PAGEREF _Toc232625655 \h </w:instrText>
         </w:r>
         <w:r>
           <w:rPr>
@@ -5268,7 +5268,7 @@
           <w:lang w:val="en-US"/>
         </w:rPr>
       </w:pPr>
-      <w:hyperlink w:anchor="_Toc232624520" w:history="1">
+      <w:hyperlink w:anchor="_Toc232625656" w:history="1">
         <w:r>
           <w:rPr>
             <w:rStyle w:val="Hyperlink"/>
@@ -5310,7 +5310,7 @@
             <w:noProof/>
             <w:webHidden/>
           </w:rPr>
-          <w:instrText xml:space="preserve"> PAGEREF _Toc232624520 \h </w:instrText>
+          <w:instrText xml:space="preserve"> PAGEREF _Toc232625656 \h </w:instrText>
         </w:r>
         <w:r>
           <w:rPr>
@@ -5353,7 +5353,7 @@
           <w:lang w:val="en-US"/>
         </w:rPr>
       </w:pPr>
-      <w:hyperlink w:anchor="_Toc232624521" w:history="1">
+      <w:hyperlink w:anchor="_Toc232625657" w:history="1">
         <w:r>
           <w:rPr>
             <w:rStyle w:val="Hyperlink"/>
@@ -5380,7 +5380,7 @@
             <w:noProof/>
             <w:webHidden/>
           </w:rPr>
-          <w:instrText xml:space="preserve"> PAGEREF _Toc232624521 \h </w:instrText>
+          <w:instrText xml:space="preserve"> PAGEREF _Toc232625657 \h </w:instrText>
         </w:r>
         <w:r>
           <w:rPr>
@@ -5423,7 +5423,7 @@
           <w:lang w:val="en-US"/>
         </w:rPr>
       </w:pPr>
-      <w:hyperlink w:anchor="_Toc232624522" w:history="1">
+      <w:hyperlink w:anchor="_Toc232625658" w:history="1">
         <w:r>
           <w:rPr>
             <w:rStyle w:val="Hyperlink"/>
@@ -5458,7 +5458,7 @@
             <w:noProof/>
             <w:webHidden/>
           </w:rPr>
-          <w:instrText xml:space="preserve"> PAGEREF _Toc232624522 \h </w:instrText>
+          <w:instrText xml:space="preserve"> PAGEREF _Toc232625658 \h </w:instrText>
         </w:r>
         <w:r>
           <w:rPr>
@@ -5501,7 +5501,7 @@
           <w:lang w:val="en-US"/>
         </w:rPr>
       </w:pPr>
-      <w:hyperlink w:anchor="_Toc232624523" w:history="1">
+      <w:hyperlink w:anchor="_Toc232625659" w:history="1">
         <w:r>
           <w:rPr>
             <w:rStyle w:val="Hyperlink"/>
@@ -5536,7 +5536,7 @@
             <w:noProof/>
             <w:webHidden/>
           </w:rPr>
-          <w:instrText xml:space="preserve"> PAGEREF _Toc232624523 \h </w:instrText>
+          <w:instrText xml:space="preserve"> PAGEREF _Toc232625659 \h </w:instrText>
         </w:r>
         <w:r>
           <w:rPr>
@@ -5579,7 +5579,7 @@
           <w:lang w:val="en-US"/>
         </w:rPr>
       </w:pPr>
-      <w:hyperlink w:anchor="_Toc232624524" w:history="1">
+      <w:hyperlink w:anchor="_Toc232625660" w:history="1">
         <w:r>
           <w:rPr>
             <w:rStyle w:val="Hyperlink"/>
@@ -5614,7 +5614,7 @@
             <w:noProof/>
             <w:webHidden/>
           </w:rPr>
-          <w:instrText xml:space="preserve"> PAGEREF _Toc232624524 \h </w:instrText>
+          <w:instrText xml:space="preserve"> PAGEREF _Toc232625660 \h </w:instrText>
         </w:r>
         <w:r>
           <w:rPr>
@@ -5658,7 +5658,7 @@
           <w:lang w:val="en-US"/>
         </w:rPr>
       </w:pPr>
-      <w:hyperlink w:anchor="_Toc232624525" w:history="1">
+      <w:hyperlink w:anchor="_Toc232625661" w:history="1">
         <w:r>
           <w:rPr>
             <w:rStyle w:val="Hyperlink"/>
@@ -5700,7 +5700,7 @@
             <w:noProof/>
             <w:webHidden/>
           </w:rPr>
-          <w:instrText xml:space="preserve"> PAGEREF _Toc232624525 \h </w:instrText>
+          <w:instrText xml:space="preserve"> PAGEREF _Toc232625661 \h </w:instrText>
         </w:r>
         <w:r>
           <w:rPr>
@@ -5743,7 +5743,7 @@
           <w:lang w:val="en-US"/>
         </w:rPr>
       </w:pPr>
-      <w:hyperlink w:anchor="_Toc232624526" w:history="1">
+      <w:hyperlink w:anchor="_Toc232625662" w:history="1">
         <w:r>
           <w:rPr>
             <w:rStyle w:val="Hyperlink"/>
@@ -5778,7 +5778,7 @@
             <w:noProof/>
             <w:webHidden/>
           </w:rPr>
-          <w:instrText xml:space="preserve"> PAGEREF _Toc232624526 \h </w:instrText>
+          <w:instrText xml:space="preserve"> PAGEREF _Toc232625662 \h </w:instrText>
         </w:r>
         <w:r>
           <w:rPr>
@@ -5821,7 +5821,7 @@
           <w:lang w:val="en-US"/>
         </w:rPr>
       </w:pPr>
-      <w:hyperlink w:anchor="_Toc232624527" w:history="1">
+      <w:hyperlink w:anchor="_Toc232625663" w:history="1">
         <w:r>
           <w:rPr>
             <w:rStyle w:val="Hyperlink"/>
@@ -5848,7 +5848,7 @@
             <w:noProof/>
             <w:webHidden/>
           </w:rPr>
-          <w:instrText xml:space="preserve"> PAGEREF _Toc232624527 \h </w:instrText>
+          <w:instrText xml:space="preserve"> PAGEREF _Toc232625663 \h </w:instrText>
         </w:r>
         <w:r>
           <w:rPr>
@@ -5891,7 +5891,7 @@
           <w:lang w:val="en-US"/>
         </w:rPr>
       </w:pPr>
-      <w:hyperlink w:anchor="_Toc232624528" w:history="1">
+      <w:hyperlink w:anchor="_Toc232625664" w:history="1">
         <w:r>
           <w:rPr>
             <w:rStyle w:val="Hyperlink"/>
@@ -5918,7 +5918,7 @@
             <w:noProof/>
             <w:webHidden/>
           </w:rPr>
-          <w:instrText xml:space="preserve"> PAGEREF _Toc232624528 \h </w:instrText>
+          <w:instrText xml:space="preserve"> PAGEREF _Toc232625664 \h </w:instrText>
         </w:r>
         <w:r>
           <w:rPr>
@@ -5961,7 +5961,7 @@
           <w:lang w:val="en-US"/>
         </w:rPr>
       </w:pPr>
-      <w:hyperlink w:anchor="_Toc232624529" w:history="1">
+      <w:hyperlink w:anchor="_Toc232625665" w:history="1">
         <w:r>
           <w:rPr>
             <w:rStyle w:val="Hyperlink"/>
@@ -5996,7 +5996,7 @@
             <w:noProof/>
             <w:webHidden/>
           </w:rPr>
-          <w:instrText xml:space="preserve"> PAGEREF _Toc232624529 \h </w:instrText>
+          <w:instrText xml:space="preserve"> PAGEREF _Toc232625665 \h </w:instrText>
         </w:r>
         <w:r>
           <w:rPr>
@@ -6040,7 +6040,7 @@
           <w:lang w:val="en-US"/>
         </w:rPr>
       </w:pPr>
-      <w:hyperlink w:anchor="_Toc232624530" w:history="1">
+      <w:hyperlink w:anchor="_Toc232625666" w:history="1">
         <w:r>
           <w:rPr>
             <w:rStyle w:val="Hyperlink"/>
@@ -6082,7 +6082,7 @@
             <w:noProof/>
             <w:webHidden/>
           </w:rPr>
-          <w:instrText xml:space="preserve"> PAGEREF _Toc232624530 \h </w:instrText>
+          <w:instrText xml:space="preserve"> PAGEREF _Toc232625666 \h </w:instrText>
         </w:r>
         <w:r>
           <w:rPr>
@@ -6125,7 +6125,7 @@
           <w:lang w:val="en-US"/>
         </w:rPr>
       </w:pPr>
-      <w:hyperlink w:anchor="_Toc232624531" w:history="1">
+      <w:hyperlink w:anchor="_Toc232625667" w:history="1">
         <w:r>
           <w:rPr>
             <w:rStyle w:val="Hyperlink"/>
@@ -6152,7 +6152,7 @@
             <w:noProof/>
             <w:webHidden/>
           </w:rPr>
-          <w:instrText xml:space="preserve"> PAGEREF _Toc232624531 \h </w:instrText>
+          <w:instrText xml:space="preserve"> PAGEREF _Toc232625667 \h </w:instrText>
         </w:r>
         <w:r>
           <w:rPr>
@@ -6195,7 +6195,7 @@
           <w:lang w:val="en-US"/>
         </w:rPr>
       </w:pPr>
-      <w:hyperlink w:anchor="_Toc232624532" w:history="1">
+      <w:hyperlink w:anchor="_Toc232625668" w:history="1">
         <w:r>
           <w:rPr>
             <w:rStyle w:val="Hyperlink"/>
@@ -6222,7 +6222,7 @@
             <w:noProof/>
             <w:webHidden/>
           </w:rPr>
-          <w:instrText xml:space="preserve"> PAGEREF _Toc232624532 \h </w:instrText>
+          <w:instrText xml:space="preserve"> PAGEREF _Toc232625668 \h </w:instrText>
         </w:r>
         <w:r>
           <w:rPr>
@@ -6265,7 +6265,7 @@
           <w:lang w:val="en-US"/>
         </w:rPr>
       </w:pPr>
-      <w:hyperlink w:anchor="_Toc232624533" w:history="1">
+      <w:hyperlink w:anchor="_Toc232625669" w:history="1">
         <w:r>
           <w:rPr>
             <w:rStyle w:val="Hyperlink"/>
@@ -6292,7 +6292,7 @@
             <w:noProof/>
             <w:webHidden/>
           </w:rPr>
-          <w:instrText xml:space="preserve"> PAGEREF _Toc232624533 \h </w:instrText>
+          <w:instrText xml:space="preserve"> PAGEREF _Toc232625669 \h </w:instrText>
         </w:r>
         <w:r>
           <w:rPr>
@@ -6336,7 +6336,7 @@
           <w:lang w:val="en-US"/>
         </w:rPr>
       </w:pPr>
-      <w:hyperlink w:anchor="_Toc232624534" w:history="1">
+      <w:hyperlink w:anchor="_Toc232625670" w:history="1">
         <w:r>
           <w:rPr>
             <w:rStyle w:val="Hyperlink"/>
@@ -6543,7 +6543,7 @@
             <w:noProof/>
             <w:webHidden/>
           </w:rPr>
-          <w:instrText xml:space="preserve"> PAGEREF _Toc232624534 \h </w:instrText>
+          <w:instrText xml:space="preserve"> PAGEREF _Toc232625670 \h </w:instrText>
         </w:r>
         <w:r>
           <w:rPr>
@@ -6587,7 +6587,7 @@
           <w:lang w:val="en-US"/>
         </w:rPr>
       </w:pPr>
-      <w:hyperlink w:anchor="_Toc232624535" w:history="1">
+      <w:hyperlink w:anchor="_Toc232625671" w:history="1">
         <w:r>
           <w:rPr>
             <w:rStyle w:val="Hyperlink"/>
@@ -6630,7 +6630,7 @@
             <w:noProof/>
             <w:webHidden/>
           </w:rPr>
-          <w:instrText xml:space="preserve"> PAGEREF _Toc232624535 \h </w:instrText>
+          <w:instrText xml:space="preserve"> PAGEREF _Toc232625671 \h </w:instrText>
         </w:r>
         <w:r>
           <w:rPr>
@@ -6674,7 +6674,7 @@
           <w:lang w:val="en-US"/>
         </w:rPr>
       </w:pPr>
-      <w:hyperlink w:anchor="_Toc232624536" w:history="1">
+      <w:hyperlink w:anchor="_Toc232625672" w:history="1">
         <w:r>
           <w:rPr>
             <w:rStyle w:val="Hyperlink"/>
@@ -6717,7 +6717,7 @@
             <w:noProof/>
             <w:webHidden/>
           </w:rPr>
-          <w:instrText xml:space="preserve"> PAGEREF _Toc232624536 \h </w:instrText>
+          <w:instrText xml:space="preserve"> PAGEREF _Toc232625672 \h </w:instrText>
         </w:r>
         <w:r>
           <w:rPr>
@@ -6760,7 +6760,7 @@
           <w:lang w:val="en-US"/>
         </w:rPr>
       </w:pPr>
-      <w:hyperlink w:anchor="_Toc232624537" w:history="1">
+      <w:hyperlink w:anchor="_Toc232625673" w:history="1">
         <w:r>
           <w:rPr>
             <w:rStyle w:val="Hyperlink"/>
@@ -6795,7 +6795,7 @@
             <w:noProof/>
             <w:webHidden/>
           </w:rPr>
-          <w:instrText xml:space="preserve"> PAGEREF _Toc232624537 \h </w:instrText>
+          <w:instrText xml:space="preserve"> PAGEREF _Toc232625673 \h </w:instrText>
         </w:r>
         <w:r>
           <w:rPr>
@@ -6838,7 +6838,7 @@
           <w:lang w:val="en-US"/>
         </w:rPr>
       </w:pPr>
-      <w:hyperlink w:anchor="_Toc232624538" w:history="1">
+      <w:hyperlink w:anchor="_Toc232625674" w:history="1">
         <w:r>
           <w:rPr>
             <w:rStyle w:val="Hyperlink"/>
@@ -6866,7 +6866,7 @@
             <w:noProof/>
             <w:webHidden/>
           </w:rPr>
-          <w:instrText xml:space="preserve"> PAGEREF _Toc232624538 \h </w:instrText>
+          <w:instrText xml:space="preserve"> PAGEREF _Toc232625674 \h </w:instrText>
         </w:r>
         <w:r>
           <w:rPr>
@@ -6909,7 +6909,7 @@
           <w:lang w:val="en-US"/>
         </w:rPr>
       </w:pPr>
-      <w:hyperlink w:anchor="_Toc232624539" w:history="1">
+      <w:hyperlink w:anchor="_Toc232625675" w:history="1">
         <w:r>
           <w:rPr>
             <w:rStyle w:val="Hyperlink"/>
@@ -6937,7 +6937,7 @@
             <w:noProof/>
             <w:webHidden/>
           </w:rPr>
-          <w:instrText xml:space="preserve"> PAGEREF _Toc232624539 \h </w:instrText>
+          <w:instrText xml:space="preserve"> PAGEREF _Toc232625675 \h </w:instrText>
         </w:r>
         <w:r>
           <w:rPr>
@@ -6980,7 +6980,7 @@
           <w:lang w:val="en-US"/>
         </w:rPr>
       </w:pPr>
-      <w:hyperlink w:anchor="_Toc232624540" w:history="1">
+      <w:hyperlink w:anchor="_Toc232625676" w:history="1">
         <w:r>
           <w:rPr>
             <w:rStyle w:val="Hyperlink"/>
@@ -7008,7 +7008,7 @@
             <w:noProof/>
             <w:webHidden/>
           </w:rPr>
-          <w:instrText xml:space="preserve"> PAGEREF _Toc232624540 \h </w:instrText>
+          <w:instrText xml:space="preserve"> PAGEREF _Toc232625676 \h </w:instrText>
         </w:r>
         <w:r>
           <w:rPr>
@@ -7051,7 +7051,7 @@
           <w:lang w:val="en-US"/>
         </w:rPr>
       </w:pPr>
-      <w:hyperlink w:anchor="_Toc232624541" w:history="1">
+      <w:hyperlink w:anchor="_Toc232625677" w:history="1">
         <w:r>
           <w:rPr>
             <w:rStyle w:val="Hyperlink"/>
@@ -7216,7 +7216,7 @@
             <w:noProof/>
             <w:webHidden/>
           </w:rPr>
-          <w:instrText xml:space="preserve"> PAGEREF _Toc232624541 \h </w:instrText>
+          <w:instrText xml:space="preserve"> PAGEREF _Toc232625677 \h </w:instrText>
         </w:r>
         <w:r>
           <w:rPr>
@@ -7259,7 +7259,7 @@
           <w:lang w:val="en-US"/>
         </w:rPr>
       </w:pPr>
-      <w:hyperlink w:anchor="_Toc232624542" w:history="1">
+      <w:hyperlink w:anchor="_Toc232625678" w:history="1">
         <w:r>
           <w:rPr>
             <w:rStyle w:val="Hyperlink"/>
@@ -7294,7 +7294,7 @@
             <w:noProof/>
             <w:webHidden/>
           </w:rPr>
-          <w:instrText xml:space="preserve"> PAGEREF _Toc232624542 \h </w:instrText>
+          <w:instrText xml:space="preserve"> PAGEREF _Toc232625678 \h </w:instrText>
         </w:r>
         <w:r>
           <w:rPr>
@@ -7337,7 +7337,7 @@
           <w:lang w:val="en-US"/>
         </w:rPr>
       </w:pPr>
-      <w:hyperlink w:anchor="_Toc232624543" w:history="1">
+      <w:hyperlink w:anchor="_Toc232625679" w:history="1">
         <w:r>
           <w:rPr>
             <w:rStyle w:val="Hyperlink"/>
@@ -7448,7 +7448,7 @@
             <w:noProof/>
             <w:webHidden/>
           </w:rPr>
-          <w:instrText xml:space="preserve"> PAGEREF _Toc232624543 \h </w:instrText>
+          <w:instrText xml:space="preserve"> PAGEREF _Toc232625679 \h </w:instrText>
         </w:r>
         <w:r>
           <w:rPr>
@@ -7491,7 +7491,7 @@
           <w:lang w:val="en-US"/>
         </w:rPr>
       </w:pPr>
-      <w:hyperlink w:anchor="_Toc232624544" w:history="1">
+      <w:hyperlink w:anchor="_Toc232625680" w:history="1">
         <w:r>
           <w:rPr>
             <w:rStyle w:val="Hyperlink"/>
@@ -7526,7 +7526,7 @@
             <w:noProof/>
             <w:webHidden/>
           </w:rPr>
-          <w:instrText xml:space="preserve"> PAGEREF _Toc232624544 \h </w:instrText>
+          <w:instrText xml:space="preserve"> PAGEREF _Toc232625680 \h </w:instrText>
         </w:r>
         <w:r>
           <w:rPr>
@@ -7569,7 +7569,7 @@
           <w:lang w:val="en-US"/>
         </w:rPr>
       </w:pPr>
-      <w:hyperlink w:anchor="_Toc232624545" w:history="1">
+      <w:hyperlink w:anchor="_Toc232625681" w:history="1">
         <w:r>
           <w:rPr>
             <w:rStyle w:val="Hyperlink"/>
@@ -7604,7 +7604,7 @@
             <w:noProof/>
             <w:webHidden/>
           </w:rPr>
-          <w:instrText xml:space="preserve"> PAGEREF _Toc232624545 \h </w:instrText>
+          <w:instrText xml:space="preserve"> PAGEREF _Toc232625681 \h </w:instrText>
         </w:r>
         <w:r>
           <w:rPr>
@@ -7647,7 +7647,7 @@
           <w:lang w:val="en-US"/>
         </w:rPr>
       </w:pPr>
-      <w:hyperlink w:anchor="_Toc232624546" w:history="1">
+      <w:hyperlink w:anchor="_Toc232625682" w:history="1">
         <w:r>
           <w:rPr>
             <w:rStyle w:val="Hyperlink"/>
@@ -7682,7 +7682,7 @@
             <w:noProof/>
             <w:webHidden/>
           </w:rPr>
-          <w:instrText xml:space="preserve"> PAGEREF _Toc232624546 \h </w:instrText>
+          <w:instrText xml:space="preserve"> PAGEREF _Toc232625682 \h </w:instrText>
         </w:r>
         <w:r>
           <w:rPr>
@@ -7725,7 +7725,7 @@
           <w:lang w:val="en-US"/>
         </w:rPr>
       </w:pPr>
-      <w:hyperlink w:anchor="_Toc232624547" w:history="1">
+      <w:hyperlink w:anchor="_Toc232625683" w:history="1">
         <w:r>
           <w:rPr>
             <w:rStyle w:val="Hyperlink"/>
@@ -7760,7 +7760,7 @@
             <w:noProof/>
             <w:webHidden/>
           </w:rPr>
-          <w:instrText xml:space="preserve"> PAGEREF _Toc232624547 \h </w:instrText>
+          <w:instrText xml:space="preserve"> PAGEREF _Toc232625683 \h </w:instrText>
         </w:r>
         <w:r>
           <w:rPr>
@@ -7780,7 +7780,7 @@
             <w:noProof/>
             <w:webHidden/>
           </w:rPr>
-          <w:t>38</w:t>
+          <w:t>37</w:t>
         </w:r>
         <w:r>
           <w:rPr>
@@ -7803,7 +7803,7 @@
           <w:lang w:val="en-US"/>
         </w:rPr>
       </w:pPr>
-      <w:hyperlink w:anchor="_Toc232624548" w:history="1">
+      <w:hyperlink w:anchor="_Toc232625684" w:history="1">
         <w:r>
           <w:rPr>
             <w:rStyle w:val="Hyperlink"/>
@@ -7838,7 +7838,7 @@
             <w:noProof/>
             <w:webHidden/>
           </w:rPr>
-          <w:instrText xml:space="preserve"> PAGEREF _Toc232624548 \h </w:instrText>
+          <w:instrText xml:space="preserve"> PAGEREF _Toc232625684 \h </w:instrText>
         </w:r>
         <w:r>
           <w:rPr>
@@ -7858,7 +7858,7 @@
             <w:noProof/>
             <w:webHidden/>
           </w:rPr>
-          <w:t>39</w:t>
+          <w:t>38</w:t>
         </w:r>
         <w:r>
           <w:rPr>
@@ -7881,7 +7881,7 @@
           <w:lang w:val="en-US"/>
         </w:rPr>
       </w:pPr>
-      <w:hyperlink w:anchor="_Toc232624549" w:history="1">
+      <w:hyperlink w:anchor="_Toc232625685" w:history="1">
         <w:r>
           <w:rPr>
             <w:rStyle w:val="Hyperlink"/>
@@ -7916,7 +7916,7 @@
             <w:noProof/>
             <w:webHidden/>
           </w:rPr>
-          <w:instrText xml:space="preserve"> PAGEREF _Toc232624549 \h </w:instrText>
+          <w:instrText xml:space="preserve"> PAGEREF _Toc232625685 \h </w:instrText>
         </w:r>
         <w:r>
           <w:rPr>
@@ -7936,7 +7936,7 @@
             <w:noProof/>
             <w:webHidden/>
           </w:rPr>
-          <w:t>40</w:t>
+          <w:t>38</w:t>
         </w:r>
         <w:r>
           <w:rPr>
@@ -7959,7 +7959,7 @@
           <w:lang w:val="en-US"/>
         </w:rPr>
       </w:pPr>
-      <w:hyperlink w:anchor="_Toc232624550" w:history="1">
+      <w:hyperlink w:anchor="_Toc232625686" w:history="1">
         <w:r>
           <w:rPr>
             <w:rStyle w:val="Hyperlink"/>
@@ -8107,7 +8107,7 @@
             <w:noProof/>
             <w:webHidden/>
           </w:rPr>
-          <w:instrText xml:space="preserve"> PAGEREF _Toc232624550 \h </w:instrText>
+          <w:instrText xml:space="preserve"> PAGEREF _Toc232625686 \h </w:instrText>
         </w:r>
         <w:r>
           <w:rPr>
@@ -8127,7 +8127,7 @@
             <w:noProof/>
             <w:webHidden/>
           </w:rPr>
-          <w:t>43</w:t>
+          <w:t>41</w:t>
         </w:r>
         <w:r>
           <w:rPr>
@@ -8151,7 +8151,7 @@
           <w:lang w:val="en-US"/>
         </w:rPr>
       </w:pPr>
-      <w:hyperlink w:anchor="_Toc232624551" w:history="1">
+      <w:hyperlink w:anchor="_Toc232625687" w:history="1">
         <w:r>
           <w:rPr>
             <w:rStyle w:val="Hyperlink"/>
@@ -8291,7 +8291,7 @@
             <w:noProof/>
             <w:webHidden/>
           </w:rPr>
-          <w:instrText xml:space="preserve"> PAGEREF _Toc232624551 \h </w:instrText>
+          <w:instrText xml:space="preserve"> PAGEREF _Toc232625687 \h </w:instrText>
         </w:r>
         <w:r>
           <w:rPr>
@@ -8311,7 +8311,7 @@
             <w:noProof/>
             <w:webHidden/>
           </w:rPr>
-          <w:t>43</w:t>
+          <w:t>41</w:t>
         </w:r>
         <w:r>
           <w:rPr>
@@ -8334,7 +8334,7 @@
           <w:lang w:val="en-US"/>
         </w:rPr>
       </w:pPr>
-      <w:hyperlink w:anchor="_Toc232624552" w:history="1">
+      <w:hyperlink w:anchor="_Toc232625688" w:history="1">
         <w:r>
           <w:rPr>
             <w:rStyle w:val="Hyperlink"/>
@@ -8362,7 +8362,7 @@
             <w:noProof/>
             <w:webHidden/>
           </w:rPr>
-          <w:instrText xml:space="preserve"> PAGEREF _Toc232624552 \h </w:instrText>
+          <w:instrText xml:space="preserve"> PAGEREF _Toc232625688 \h </w:instrText>
         </w:r>
         <w:r>
           <w:rPr>
@@ -8382,7 +8382,7 @@
             <w:noProof/>
             <w:webHidden/>
           </w:rPr>
-          <w:t>43</w:t>
+          <w:t>41</w:t>
         </w:r>
         <w:r>
           <w:rPr>
@@ -8405,7 +8405,7 @@
           <w:lang w:val="en-US"/>
         </w:rPr>
       </w:pPr>
-      <w:hyperlink w:anchor="_Toc232624553" w:history="1">
+      <w:hyperlink w:anchor="_Toc232625689" w:history="1">
         <w:r>
           <w:rPr>
             <w:rStyle w:val="Hyperlink"/>
@@ -8433,7 +8433,7 @@
             <w:noProof/>
             <w:webHidden/>
           </w:rPr>
-          <w:instrText xml:space="preserve"> PAGEREF _Toc232624553 \h </w:instrText>
+          <w:instrText xml:space="preserve"> PAGEREF _Toc232625689 \h </w:instrText>
         </w:r>
         <w:r>
           <w:rPr>
@@ -8453,7 +8453,7 @@
             <w:noProof/>
             <w:webHidden/>
           </w:rPr>
-          <w:t>43</w:t>
+          <w:t>41</w:t>
         </w:r>
         <w:r>
           <w:rPr>
@@ -8476,7 +8476,7 @@
           <w:lang w:val="en-US"/>
         </w:rPr>
       </w:pPr>
-      <w:hyperlink w:anchor="_Toc232624554" w:history="1">
+      <w:hyperlink w:anchor="_Toc232625690" w:history="1">
         <w:r>
           <w:rPr>
             <w:rStyle w:val="Hyperlink"/>
@@ -8504,7 +8504,7 @@
             <w:noProof/>
             <w:webHidden/>
           </w:rPr>
-          <w:instrText xml:space="preserve"> PAGEREF _Toc232624554 \h </w:instrText>
+          <w:instrText xml:space="preserve"> PAGEREF _Toc232625690 \h </w:instrText>
         </w:r>
         <w:r>
           <w:rPr>
@@ -8524,7 +8524,7 @@
             <w:noProof/>
             <w:webHidden/>
           </w:rPr>
-          <w:t>43</w:t>
+          <w:t>41</w:t>
         </w:r>
         <w:r>
           <w:rPr>
@@ -8547,7 +8547,7 @@
           <w:lang w:val="en-US"/>
         </w:rPr>
       </w:pPr>
-      <w:hyperlink w:anchor="_Toc232624555" w:history="1">
+      <w:hyperlink w:anchor="_Toc232625691" w:history="1">
         <w:r>
           <w:rPr>
             <w:rStyle w:val="Hyperlink"/>
@@ -8575,7 +8575,7 @@
             <w:noProof/>
             <w:webHidden/>
           </w:rPr>
-          <w:instrText xml:space="preserve"> PAGEREF _Toc232624555 \h </w:instrText>
+          <w:instrText xml:space="preserve"> PAGEREF _Toc232625691 \h </w:instrText>
         </w:r>
         <w:r>
           <w:rPr>
@@ -8595,7 +8595,7 @@
             <w:noProof/>
             <w:webHidden/>
           </w:rPr>
-          <w:t>43</w:t>
+          <w:t>41</w:t>
         </w:r>
         <w:r>
           <w:rPr>
@@ -8618,7 +8618,7 @@
           <w:lang w:val="en-US"/>
         </w:rPr>
       </w:pPr>
-      <w:hyperlink w:anchor="_Toc232624556" w:history="1">
+      <w:hyperlink w:anchor="_Toc232625692" w:history="1">
         <w:r>
           <w:rPr>
             <w:rStyle w:val="Hyperlink"/>
@@ -8646,7 +8646,7 @@
             <w:noProof/>
             <w:webHidden/>
           </w:rPr>
-          <w:instrText xml:space="preserve"> PAGEREF _Toc232624556 \h </w:instrText>
+          <w:instrText xml:space="preserve"> PAGEREF _Toc232625692 \h </w:instrText>
         </w:r>
         <w:r>
           <w:rPr>
@@ -8666,7 +8666,7 @@
             <w:noProof/>
             <w:webHidden/>
           </w:rPr>
-          <w:t>43</w:t>
+          <w:t>41</w:t>
         </w:r>
         <w:r>
           <w:rPr>
@@ -8689,7 +8689,7 @@
           <w:lang w:val="en-US"/>
         </w:rPr>
       </w:pPr>
-      <w:hyperlink w:anchor="_Toc232624557" w:history="1">
+      <w:hyperlink w:anchor="_Toc232625693" w:history="1">
         <w:r>
           <w:rPr>
             <w:rStyle w:val="Hyperlink"/>
@@ -8724,7 +8724,7 @@
             <w:noProof/>
             <w:webHidden/>
           </w:rPr>
-          <w:instrText xml:space="preserve"> PAGEREF _Toc232624557 \h </w:instrText>
+          <w:instrText xml:space="preserve"> PAGEREF _Toc232625693 \h </w:instrText>
         </w:r>
         <w:r>
           <w:rPr>
@@ -8744,7 +8744,7 @@
             <w:noProof/>
             <w:webHidden/>
           </w:rPr>
-          <w:t>44</w:t>
+          <w:t>42</w:t>
         </w:r>
         <w:r>
           <w:rPr>
@@ -8768,7 +8768,7 @@
           <w:lang w:val="en-US"/>
         </w:rPr>
       </w:pPr>
-      <w:hyperlink w:anchor="_Toc232624558" w:history="1">
+      <w:hyperlink w:anchor="_Toc232625694" w:history="1">
         <w:r>
           <w:rPr>
             <w:rStyle w:val="Hyperlink"/>
@@ -8812,7 +8812,7 @@
             <w:noProof/>
             <w:webHidden/>
           </w:rPr>
-          <w:instrText xml:space="preserve"> PAGEREF _Toc232624558 \h </w:instrText>
+          <w:instrText xml:space="preserve"> PAGEREF _Toc232625694 \h </w:instrText>
         </w:r>
         <w:r>
           <w:rPr>
@@ -8832,7 +8832,7 @@
             <w:noProof/>
             <w:webHidden/>
           </w:rPr>
-          <w:t>44</w:t>
+          <w:t>42</w:t>
         </w:r>
         <w:r>
           <w:rPr>
@@ -8855,7 +8855,7 @@
           <w:lang w:val="en-US"/>
         </w:rPr>
       </w:pPr>
-      <w:hyperlink w:anchor="_Toc232624559" w:history="1">
+      <w:hyperlink w:anchor="_Toc232625695" w:history="1">
         <w:r>
           <w:rPr>
             <w:rStyle w:val="Hyperlink"/>
@@ -8890,7 +8890,7 @@
             <w:noProof/>
             <w:webHidden/>
           </w:rPr>
-          <w:instrText xml:space="preserve"> PAGEREF _Toc232624559 \h </w:instrText>
+          <w:instrText xml:space="preserve"> PAGEREF _Toc232625695 \h </w:instrText>
         </w:r>
         <w:r>
           <w:rPr>
@@ -8910,7 +8910,7 @@
             <w:noProof/>
             <w:webHidden/>
           </w:rPr>
-          <w:t>44</w:t>
+          <w:t>42</w:t>
         </w:r>
         <w:r>
           <w:rPr>
@@ -8933,7 +8933,7 @@
           <w:lang w:val="en-US"/>
         </w:rPr>
       </w:pPr>
-      <w:hyperlink w:anchor="_Toc232624560" w:history="1">
+      <w:hyperlink w:anchor="_Toc232625696" w:history="1">
         <w:r>
           <w:rPr>
             <w:rStyle w:val="Hyperlink"/>
@@ -8968,7 +8968,7 @@
             <w:noProof/>
             <w:webHidden/>
           </w:rPr>
-          <w:instrText xml:space="preserve"> PAGEREF _Toc232624560 \h </w:instrText>
+          <w:instrText xml:space="preserve"> PAGEREF _Toc232625696 \h </w:instrText>
         </w:r>
         <w:r>
           <w:rPr>
@@ -8988,7 +8988,7 @@
             <w:noProof/>
             <w:webHidden/>
           </w:rPr>
-          <w:t>45</w:t>
+          <w:t>43</w:t>
         </w:r>
         <w:r>
           <w:rPr>
@@ -9011,7 +9011,7 @@
           <w:lang w:val="en-US"/>
         </w:rPr>
       </w:pPr>
-      <w:hyperlink w:anchor="_Toc232624561" w:history="1">
+      <w:hyperlink w:anchor="_Toc232625697" w:history="1">
         <w:r>
           <w:rPr>
             <w:rStyle w:val="Hyperlink"/>
@@ -9039,7 +9039,7 @@
             <w:noProof/>
             <w:webHidden/>
           </w:rPr>
-          <w:instrText xml:space="preserve"> PAGEREF _Toc232624561 \h </w:instrText>
+          <w:instrText xml:space="preserve"> PAGEREF _Toc232625697 \h </w:instrText>
         </w:r>
         <w:r>
           <w:rPr>
@@ -9059,7 +9059,7 @@
             <w:noProof/>
             <w:webHidden/>
           </w:rPr>
-          <w:t>46</w:t>
+          <w:t>44</w:t>
         </w:r>
         <w:r>
           <w:rPr>
@@ -9082,7 +9082,7 @@
           <w:lang w:val="en-US"/>
         </w:rPr>
       </w:pPr>
-      <w:hyperlink w:anchor="_Toc232624562" w:history="1">
+      <w:hyperlink w:anchor="_Toc232625698" w:history="1">
         <w:r>
           <w:rPr>
             <w:rStyle w:val="Hyperlink"/>
@@ -9110,7 +9110,7 @@
             <w:noProof/>
             <w:webHidden/>
           </w:rPr>
-          <w:instrText xml:space="preserve"> PAGEREF _Toc232624562 \h </w:instrText>
+          <w:instrText xml:space="preserve"> PAGEREF _Toc232625698 \h </w:instrText>
         </w:r>
         <w:r>
           <w:rPr>
@@ -9130,7 +9130,7 @@
             <w:noProof/>
             <w:webHidden/>
           </w:rPr>
-          <w:t>47</w:t>
+          <w:t>45</w:t>
         </w:r>
         <w:r>
           <w:rPr>
@@ -9153,7 +9153,7 @@
           <w:lang w:val="en-US"/>
         </w:rPr>
       </w:pPr>
-      <w:hyperlink w:anchor="_Toc232624563" w:history="1">
+      <w:hyperlink w:anchor="_Toc232625699" w:history="1">
         <w:r>
           <w:rPr>
             <w:rStyle w:val="Hyperlink"/>
@@ -9188,7 +9188,7 @@
             <w:noProof/>
             <w:webHidden/>
           </w:rPr>
-          <w:instrText xml:space="preserve"> PAGEREF _Toc232624563 \h </w:instrText>
+          <w:instrText xml:space="preserve"> PAGEREF _Toc232625699 \h </w:instrText>
         </w:r>
         <w:r>
           <w:rPr>
@@ -9208,7 +9208,7 @@
             <w:noProof/>
             <w:webHidden/>
           </w:rPr>
-          <w:t>48</w:t>
+          <w:t>46</w:t>
         </w:r>
         <w:r>
           <w:rPr>
@@ -9231,7 +9231,7 @@
           <w:lang w:val="en-US"/>
         </w:rPr>
       </w:pPr>
-      <w:hyperlink w:anchor="_Toc232624564" w:history="1">
+      <w:hyperlink w:anchor="_Toc232625700" w:history="1">
         <w:r>
           <w:rPr>
             <w:rStyle w:val="Hyperlink"/>
@@ -9266,7 +9266,7 @@
             <w:noProof/>
             <w:webHidden/>
           </w:rPr>
-          <w:instrText xml:space="preserve"> PAGEREF _Toc232624564 \h </w:instrText>
+          <w:instrText xml:space="preserve"> PAGEREF _Toc232625700 \h </w:instrText>
         </w:r>
         <w:r>
           <w:rPr>
@@ -9286,7 +9286,7 @@
             <w:noProof/>
             <w:webHidden/>
           </w:rPr>
-          <w:t>54</w:t>
+          <w:t>51</w:t>
         </w:r>
         <w:r>
           <w:rPr>
@@ -9309,7 +9309,7 @@
           <w:lang w:val="en-US"/>
         </w:rPr>
       </w:pPr>
-      <w:hyperlink w:anchor="_Toc232624565" w:history="1">
+      <w:hyperlink w:anchor="_Toc232625701" w:history="1">
         <w:r>
           <w:rPr>
             <w:rStyle w:val="Hyperlink"/>
@@ -9337,7 +9337,7 @@
             <w:noProof/>
             <w:webHidden/>
           </w:rPr>
-          <w:instrText xml:space="preserve"> PAGEREF _Toc232624565 \h </w:instrText>
+          <w:instrText xml:space="preserve"> PAGEREF _Toc232625701 \h </w:instrText>
         </w:r>
         <w:r>
           <w:rPr>
@@ -9357,7 +9357,7 @@
             <w:noProof/>
             <w:webHidden/>
           </w:rPr>
-          <w:t>55</w:t>
+          <w:t>52</w:t>
         </w:r>
         <w:r>
           <w:rPr>
@@ -9380,7 +9380,7 @@
           <w:lang w:val="en-US"/>
         </w:rPr>
       </w:pPr>
-      <w:hyperlink w:anchor="_Toc232624566" w:history="1">
+      <w:hyperlink w:anchor="_Toc232625702" w:history="1">
         <w:r>
           <w:rPr>
             <w:rStyle w:val="Hyperlink"/>
@@ -9450,7 +9450,7 @@
             <w:noProof/>
             <w:webHidden/>
           </w:rPr>
-          <w:instrText xml:space="preserve"> PAGEREF _Toc232624566 \h </w:instrText>
+          <w:instrText xml:space="preserve"> PAGEREF _Toc232625702 \h </w:instrText>
         </w:r>
         <w:r>
           <w:rPr>
@@ -9470,7 +9470,7 @@
             <w:noProof/>
             <w:webHidden/>
           </w:rPr>
-          <w:t>55</w:t>
+          <w:t>52</w:t>
         </w:r>
         <w:r>
           <w:rPr>
@@ -9493,7 +9493,7 @@
           <w:lang w:val="en-US"/>
         </w:rPr>
       </w:pPr>
-      <w:hyperlink w:anchor="_Toc232624567" w:history="1">
+      <w:hyperlink w:anchor="_Toc232625703" w:history="1">
         <w:r>
           <w:rPr>
             <w:rStyle w:val="Hyperlink"/>
@@ -9520,7 +9520,7 @@
             <w:noProof/>
             <w:webHidden/>
           </w:rPr>
-          <w:instrText xml:space="preserve"> PAGEREF _Toc232624567 \h </w:instrText>
+          <w:instrText xml:space="preserve"> PAGEREF _Toc232625703 \h </w:instrText>
         </w:r>
         <w:r>
           <w:rPr>
@@ -9540,7 +9540,7 @@
             <w:noProof/>
             <w:webHidden/>
           </w:rPr>
-          <w:t>55</w:t>
+          <w:t>52</w:t>
         </w:r>
         <w:r>
           <w:rPr>
@@ -9563,7 +9563,7 @@
           <w:lang w:val="en-US"/>
         </w:rPr>
       </w:pPr>
-      <w:hyperlink w:anchor="_Toc232624568" w:history="1">
+      <w:hyperlink w:anchor="_Toc232625704" w:history="1">
         <w:r>
           <w:rPr>
             <w:rStyle w:val="Hyperlink"/>
@@ -9590,7 +9590,7 @@
             <w:noProof/>
             <w:webHidden/>
           </w:rPr>
-          <w:instrText xml:space="preserve"> PAGEREF _Toc232624568 \h </w:instrText>
+          <w:instrText xml:space="preserve"> PAGEREF _Toc232625704 \h </w:instrText>
         </w:r>
         <w:r>
           <w:rPr>
@@ -9610,7 +9610,7 @@
             <w:noProof/>
             <w:webHidden/>
           </w:rPr>
-          <w:t>56</w:t>
+          <w:t>53</w:t>
         </w:r>
         <w:r>
           <w:rPr>
@@ -9633,7 +9633,7 @@
           <w:lang w:val="en-US"/>
         </w:rPr>
       </w:pPr>
-      <w:hyperlink w:anchor="_Toc232624569" w:history="1">
+      <w:hyperlink w:anchor="_Toc232625705" w:history="1">
         <w:r>
           <w:rPr>
             <w:rStyle w:val="Hyperlink"/>
@@ -9660,7 +9660,7 @@
             <w:noProof/>
             <w:webHidden/>
           </w:rPr>
-          <w:instrText xml:space="preserve"> PAGEREF _Toc232624569 \h </w:instrText>
+          <w:instrText xml:space="preserve"> PAGEREF _Toc232625705 \h </w:instrText>
         </w:r>
         <w:r>
           <w:rPr>
@@ -9680,7 +9680,7 @@
             <w:noProof/>
             <w:webHidden/>
           </w:rPr>
-          <w:t>56</w:t>
+          <w:t>53</w:t>
         </w:r>
         <w:r>
           <w:rPr>
@@ -9703,7 +9703,7 @@
           <w:lang w:val="en-US"/>
         </w:rPr>
       </w:pPr>
-      <w:hyperlink w:anchor="_Toc232624570" w:history="1">
+      <w:hyperlink w:anchor="_Toc232625706" w:history="1">
         <w:r>
           <w:rPr>
             <w:rStyle w:val="Hyperlink"/>
@@ -9730,7 +9730,7 @@
             <w:noProof/>
             <w:webHidden/>
           </w:rPr>
-          <w:instrText xml:space="preserve"> PAGEREF _Toc232624570 \h </w:instrText>
+          <w:instrText xml:space="preserve"> PAGEREF _Toc232625706 \h </w:instrText>
         </w:r>
         <w:r>
           <w:rPr>
@@ -9750,7 +9750,7 @@
             <w:noProof/>
             <w:webHidden/>
           </w:rPr>
-          <w:t>57</w:t>
+          <w:t>54</w:t>
         </w:r>
         <w:r>
           <w:rPr>
@@ -9773,7 +9773,7 @@
           <w:lang w:val="en-US"/>
         </w:rPr>
       </w:pPr>
-      <w:hyperlink w:anchor="_Toc232624571" w:history="1">
+      <w:hyperlink w:anchor="_Toc232625707" w:history="1">
         <w:r>
           <w:rPr>
             <w:rStyle w:val="Hyperlink"/>
@@ -9800,7 +9800,7 @@
             <w:noProof/>
             <w:webHidden/>
           </w:rPr>
-          <w:instrText xml:space="preserve"> PAGEREF _Toc232624571 \h </w:instrText>
+          <w:instrText xml:space="preserve"> PAGEREF _Toc232625707 \h </w:instrText>
         </w:r>
         <w:r>
           <w:rPr>
@@ -9820,7 +9820,7 @@
             <w:noProof/>
             <w:webHidden/>
           </w:rPr>
-          <w:t>57</w:t>
+          <w:t>54</w:t>
         </w:r>
         <w:r>
           <w:rPr>
@@ -9843,7 +9843,7 @@
           <w:lang w:val="en-US"/>
         </w:rPr>
       </w:pPr>
-      <w:hyperlink w:anchor="_Toc232624572" w:history="1">
+      <w:hyperlink w:anchor="_Toc232625708" w:history="1">
         <w:r>
           <w:rPr>
             <w:rStyle w:val="Hyperlink"/>
@@ -9870,7 +9870,7 @@
             <w:noProof/>
             <w:webHidden/>
           </w:rPr>
-          <w:instrText xml:space="preserve"> PAGEREF _Toc232624572 \h </w:instrText>
+          <w:instrText xml:space="preserve"> PAGEREF _Toc232625708 \h </w:instrText>
         </w:r>
         <w:r>
           <w:rPr>
@@ -9890,7 +9890,7 @@
             <w:noProof/>
             <w:webHidden/>
           </w:rPr>
-          <w:t>57</w:t>
+          <w:t>54</w:t>
         </w:r>
         <w:r>
           <w:rPr>
@@ -9913,7 +9913,7 @@
           <w:lang w:val="en-US"/>
         </w:rPr>
       </w:pPr>
-      <w:hyperlink w:anchor="_Toc232624573" w:history="1">
+      <w:hyperlink w:anchor="_Toc232625709" w:history="1">
         <w:r>
           <w:rPr>
             <w:rStyle w:val="Hyperlink"/>
@@ -9940,7 +9940,7 @@
             <w:noProof/>
             <w:webHidden/>
           </w:rPr>
-          <w:instrText xml:space="preserve"> PAGEREF _Toc232624573 \h </w:instrText>
+          <w:instrText xml:space="preserve"> PAGEREF _Toc232625709 \h </w:instrText>
         </w:r>
         <w:r>
           <w:rPr>
@@ -9960,7 +9960,7 @@
             <w:noProof/>
             <w:webHidden/>
           </w:rPr>
-          <w:t>58</w:t>
+          <w:t>55</w:t>
         </w:r>
         <w:r>
           <w:rPr>
@@ -9983,7 +9983,7 @@
           <w:lang w:val="en-US"/>
         </w:rPr>
       </w:pPr>
-      <w:hyperlink w:anchor="_Toc232624574" w:history="1">
+      <w:hyperlink w:anchor="_Toc232625710" w:history="1">
         <w:r>
           <w:rPr>
             <w:rStyle w:val="Hyperlink"/>
@@ -10018,7 +10018,7 @@
             <w:noProof/>
             <w:webHidden/>
           </w:rPr>
-          <w:instrText xml:space="preserve"> PAGEREF _Toc232624574 \h </w:instrText>
+          <w:instrText xml:space="preserve"> PAGEREF _Toc232625710 \h </w:instrText>
         </w:r>
         <w:r>
           <w:rPr>
@@ -10038,7 +10038,7 @@
             <w:noProof/>
             <w:webHidden/>
           </w:rPr>
-          <w:t>58</w:t>
+          <w:t>55</w:t>
         </w:r>
         <w:r>
           <w:rPr>
@@ -10061,7 +10061,7 @@
           <w:lang w:val="en-US"/>
         </w:rPr>
       </w:pPr>
-      <w:hyperlink w:anchor="_Toc232624575" w:history="1">
+      <w:hyperlink w:anchor="_Toc232625711" w:history="1">
         <w:r>
           <w:rPr>
             <w:rStyle w:val="Hyperlink"/>
@@ -10088,7 +10088,7 @@
             <w:noProof/>
             <w:webHidden/>
           </w:rPr>
-          <w:instrText xml:space="preserve"> PAGEREF _Toc232624575 \h </w:instrText>
+          <w:instrText xml:space="preserve"> PAGEREF _Toc232625711 \h </w:instrText>
         </w:r>
         <w:r>
           <w:rPr>
@@ -10108,7 +10108,7 @@
             <w:noProof/>
             <w:webHidden/>
           </w:rPr>
-          <w:t>58</w:t>
+          <w:t>55</w:t>
         </w:r>
         <w:r>
           <w:rPr>
@@ -10131,7 +10131,7 @@
           <w:lang w:val="en-US"/>
         </w:rPr>
       </w:pPr>
-      <w:hyperlink w:anchor="_Toc232624576" w:history="1">
+      <w:hyperlink w:anchor="_Toc232625712" w:history="1">
         <w:r>
           <w:rPr>
             <w:rStyle w:val="Hyperlink"/>
@@ -10158,7 +10158,7 @@
             <w:noProof/>
             <w:webHidden/>
           </w:rPr>
-          <w:instrText xml:space="preserve"> PAGEREF _Toc232624576 \h </w:instrText>
+          <w:instrText xml:space="preserve"> PAGEREF _Toc232625712 \h </w:instrText>
         </w:r>
         <w:r>
           <w:rPr>
@@ -10178,7 +10178,7 @@
             <w:noProof/>
             <w:webHidden/>
           </w:rPr>
-          <w:t>58</w:t>
+          <w:t>55</w:t>
         </w:r>
         <w:r>
           <w:rPr>
@@ -10201,7 +10201,7 @@
           <w:lang w:val="en-US"/>
         </w:rPr>
       </w:pPr>
-      <w:hyperlink w:anchor="_Toc232624577" w:history="1">
+      <w:hyperlink w:anchor="_Toc232625713" w:history="1">
         <w:r>
           <w:rPr>
             <w:rStyle w:val="Hyperlink"/>
@@ -10228,7 +10228,7 @@
             <w:noProof/>
             <w:webHidden/>
           </w:rPr>
-          <w:instrText xml:space="preserve"> PAGEREF _Toc232624577 \h </w:instrText>
+          <w:instrText xml:space="preserve"> PAGEREF _Toc232625713 \h </w:instrText>
         </w:r>
         <w:r>
           <w:rPr>
@@ -10248,7 +10248,7 @@
             <w:noProof/>
             <w:webHidden/>
           </w:rPr>
-          <w:t>58</w:t>
+          <w:t>55</w:t>
         </w:r>
         <w:r>
           <w:rPr>
@@ -10271,7 +10271,7 @@
           <w:lang w:val="en-US"/>
         </w:rPr>
       </w:pPr>
-      <w:hyperlink w:anchor="_Toc232624578" w:history="1">
+      <w:hyperlink w:anchor="_Toc232625714" w:history="1">
         <w:r>
           <w:rPr>
             <w:rStyle w:val="Hyperlink"/>
@@ -10298,7 +10298,7 @@
             <w:noProof/>
             <w:webHidden/>
           </w:rPr>
-          <w:instrText xml:space="preserve"> PAGEREF _Toc232624578 \h </w:instrText>
+          <w:instrText xml:space="preserve"> PAGEREF _Toc232625714 \h </w:instrText>
         </w:r>
         <w:r>
           <w:rPr>
@@ -10318,7 +10318,7 @@
             <w:noProof/>
             <w:webHidden/>
           </w:rPr>
-          <w:t>59</w:t>
+          <w:t>56</w:t>
         </w:r>
         <w:r>
           <w:rPr>
@@ -10341,7 +10341,7 @@
           <w:lang w:val="en-US"/>
         </w:rPr>
       </w:pPr>
-      <w:hyperlink w:anchor="_Toc232624579" w:history="1">
+      <w:hyperlink w:anchor="_Toc232625715" w:history="1">
         <w:r>
           <w:rPr>
             <w:rStyle w:val="Hyperlink"/>
@@ -10368,7 +10368,7 @@
             <w:noProof/>
             <w:webHidden/>
           </w:rPr>
-          <w:instrText xml:space="preserve"> PAGEREF _Toc232624579 \h </w:instrText>
+          <w:instrText xml:space="preserve"> PAGEREF _Toc232625715 \h </w:instrText>
         </w:r>
         <w:r>
           <w:rPr>
@@ -10388,7 +10388,7 @@
             <w:noProof/>
             <w:webHidden/>
           </w:rPr>
-          <w:t>59</w:t>
+          <w:t>56</w:t>
         </w:r>
         <w:r>
           <w:rPr>
@@ -10411,7 +10411,7 @@
           <w:lang w:val="en-US"/>
         </w:rPr>
       </w:pPr>
-      <w:hyperlink w:anchor="_Toc232624580" w:history="1">
+      <w:hyperlink w:anchor="_Toc232625716" w:history="1">
         <w:r>
           <w:rPr>
             <w:rStyle w:val="Hyperlink"/>
@@ -10438,7 +10438,7 @@
             <w:noProof/>
             <w:webHidden/>
           </w:rPr>
-          <w:instrText xml:space="preserve"> PAGEREF _Toc232624580 \h </w:instrText>
+          <w:instrText xml:space="preserve"> PAGEREF _Toc232625716 \h </w:instrText>
         </w:r>
         <w:r>
           <w:rPr>
@@ -10458,7 +10458,7 @@
             <w:noProof/>
             <w:webHidden/>
           </w:rPr>
-          <w:t>59</w:t>
+          <w:t>56</w:t>
         </w:r>
         <w:r>
           <w:rPr>
@@ -10481,7 +10481,7 @@
           <w:lang w:val="en-US"/>
         </w:rPr>
       </w:pPr>
-      <w:hyperlink w:anchor="_Toc232624581" w:history="1">
+      <w:hyperlink w:anchor="_Toc232625717" w:history="1">
         <w:r>
           <w:rPr>
             <w:rStyle w:val="Hyperlink"/>
@@ -10508,7 +10508,7 @@
             <w:noProof/>
             <w:webHidden/>
           </w:rPr>
-          <w:instrText xml:space="preserve"> PAGEREF _Toc232624581 \h </w:instrText>
+          <w:instrText xml:space="preserve"> PAGEREF _Toc232625717 \h </w:instrText>
         </w:r>
         <w:r>
           <w:rPr>
@@ -10528,7 +10528,7 @@
             <w:noProof/>
             <w:webHidden/>
           </w:rPr>
-          <w:t>59</w:t>
+          <w:t>56</w:t>
         </w:r>
         <w:r>
           <w:rPr>
@@ -10551,7 +10551,7 @@
           <w:lang w:val="en-US"/>
         </w:rPr>
       </w:pPr>
-      <w:hyperlink w:anchor="_Toc232624582" w:history="1">
+      <w:hyperlink w:anchor="_Toc232625718" w:history="1">
         <w:r>
           <w:rPr>
             <w:rStyle w:val="Hyperlink"/>
@@ -10579,7 +10579,7 @@
             <w:noProof/>
             <w:webHidden/>
           </w:rPr>
-          <w:instrText xml:space="preserve"> PAGEREF _Toc232624582 \h </w:instrText>
+          <w:instrText xml:space="preserve"> PAGEREF _Toc232625718 \h </w:instrText>
         </w:r>
         <w:r>
           <w:rPr>
@@ -10599,7 +10599,7 @@
             <w:noProof/>
             <w:webHidden/>
           </w:rPr>
-          <w:t>59</w:t>
+          <w:t>56</w:t>
         </w:r>
         <w:r>
           <w:rPr>
@@ -10612,7 +10612,7 @@
     </w:p>
     <w:p>
       <w:pPr>
-        <w:pStyle w:val="TOC1"/>
+        <w:pStyle w:val="TOC4"/>
         <w:tabs>
           <w:tab w:val="right" w:leader="dot" w:pos="9063"/>
         </w:tabs>
@@ -10622,14 +10622,21 @@
           <w:lang w:val="en-US"/>
         </w:rPr>
       </w:pPr>
-      <w:hyperlink w:anchor="_Toc232624583" w:history="1">
+      <w:hyperlink w:anchor="_Toc232625719" w:history="1">
         <w:r>
           <w:rPr>
             <w:rStyle w:val="Hyperlink"/>
             <w:noProof/>
             <w:lang w:val="en-US"/>
           </w:rPr>
-          <w:t>PHỤ LỤC</w:t>
+          <w:t>A</w:t>
+        </w:r>
+        <w:r>
+          <w:rPr>
+            <w:rStyle w:val="Hyperlink"/>
+            <w:noProof/>
+          </w:rPr>
+          <w:t>. Tài liệu tiếng Việt</w:t>
         </w:r>
         <w:r>
           <w:rPr>
@@ -10650,7 +10657,7 @@
             <w:noProof/>
             <w:webHidden/>
           </w:rPr>
-          <w:instrText xml:space="preserve"> PAGEREF _Toc232624583 \h </w:instrText>
+          <w:instrText xml:space="preserve"> PAGEREF _Toc232625719 \h </w:instrText>
         </w:r>
         <w:r>
           <w:rPr>
@@ -10670,7 +10677,7 @@
             <w:noProof/>
             <w:webHidden/>
           </w:rPr>
-          <w:t>60</w:t>
+          <w:t>56</w:t>
         </w:r>
         <w:r>
           <w:rPr>
@@ -10683,7 +10690,7 @@
     </w:p>
     <w:p>
       <w:pPr>
-        <w:pStyle w:val="TOC3"/>
+        <w:pStyle w:val="TOC4"/>
         <w:tabs>
           <w:tab w:val="right" w:leader="dot" w:pos="9063"/>
         </w:tabs>
@@ -10693,14 +10700,21 @@
           <w:lang w:val="en-US"/>
         </w:rPr>
       </w:pPr>
-      <w:hyperlink w:anchor="_Toc232624584" w:history="1">
+      <w:hyperlink w:anchor="_Toc232625720" w:history="1">
         <w:r>
           <w:rPr>
             <w:rStyle w:val="Hyperlink"/>
             <w:noProof/>
             <w:lang w:val="en-US"/>
           </w:rPr>
-          <w:t>Link mã nguồn tại github: https://github.com/trungnt2026/build_chat_official</w:t>
+          <w:t>B</w:t>
+        </w:r>
+        <w:r>
+          <w:rPr>
+            <w:rStyle w:val="Hyperlink"/>
+            <w:noProof/>
+          </w:rPr>
+          <w:t>. Tài liệu tiếng Anh (Tài liệu quốc tế)</w:t>
         </w:r>
         <w:r>
           <w:rPr>
@@ -10721,7 +10735,7 @@
             <w:noProof/>
             <w:webHidden/>
           </w:rPr>
-          <w:instrText xml:space="preserve"> PAGEREF _Toc232624584 \h </w:instrText>
+          <w:instrText xml:space="preserve"> PAGEREF _Toc232625720 \h </w:instrText>
         </w:r>
         <w:r>
           <w:rPr>
@@ -10741,7 +10755,7 @@
             <w:noProof/>
             <w:webHidden/>
           </w:rPr>
-          <w:t>60</w:t>
+          <w:t>57</w:t>
         </w:r>
         <w:r>
           <w:rPr>
@@ -10754,7 +10768,7 @@
     </w:p>
     <w:p>
       <w:pPr>
-        <w:pStyle w:val="TOC3"/>
+        <w:pStyle w:val="TOC4"/>
         <w:tabs>
           <w:tab w:val="right" w:leader="dot" w:pos="9063"/>
         </w:tabs>
@@ -10764,13 +10778,233 @@
           <w:lang w:val="en-US"/>
         </w:rPr>
       </w:pPr>
-      <w:hyperlink w:anchor="_Toc232624585" w:history="1">
+      <w:hyperlink w:anchor="_Toc232625721" w:history="1">
         <w:r>
           <w:rPr>
             <w:rStyle w:val="Hyperlink"/>
             <w:noProof/>
             <w:lang w:val="en-US"/>
           </w:rPr>
+          <w:t xml:space="preserve">C. </w:t>
+        </w:r>
+        <w:r>
+          <w:rPr>
+            <w:rStyle w:val="Hyperlink"/>
+            <w:noProof/>
+          </w:rPr>
+          <w:t>Một số trang Web hướng dẫn thực hiện ứng dụng tham khảo:</w:t>
+        </w:r>
+        <w:r>
+          <w:rPr>
+            <w:noProof/>
+            <w:webHidden/>
+          </w:rPr>
+          <w:tab/>
+        </w:r>
+        <w:r>
+          <w:rPr>
+            <w:noProof/>
+            <w:webHidden/>
+          </w:rPr>
+          <w:fldChar w:fldCharType="begin"/>
+        </w:r>
+        <w:r>
+          <w:rPr>
+            <w:noProof/>
+            <w:webHidden/>
+          </w:rPr>
+          <w:instrText xml:space="preserve"> PAGEREF _Toc232625721 \h </w:instrText>
+        </w:r>
+        <w:r>
+          <w:rPr>
+            <w:noProof/>
+            <w:webHidden/>
+          </w:rPr>
+        </w:r>
+        <w:r>
+          <w:rPr>
+            <w:noProof/>
+            <w:webHidden/>
+          </w:rPr>
+          <w:fldChar w:fldCharType="separate"/>
+        </w:r>
+        <w:r>
+          <w:rPr>
+            <w:noProof/>
+            <w:webHidden/>
+          </w:rPr>
+          <w:t>57</w:t>
+        </w:r>
+        <w:r>
+          <w:rPr>
+            <w:noProof/>
+            <w:webHidden/>
+          </w:rPr>
+          <w:fldChar w:fldCharType="end"/>
+        </w:r>
+      </w:hyperlink>
+    </w:p>
+    <w:p>
+      <w:pPr>
+        <w:pStyle w:val="TOC1"/>
+        <w:tabs>
+          <w:tab w:val="right" w:leader="dot" w:pos="9063"/>
+        </w:tabs>
+        <w:rPr>
+          <w:rFonts w:asciiTheme="minorHAnsi" w:eastAsiaTheme="minorEastAsia" w:hAnsiTheme="minorHAnsi" w:cstheme="minorBidi"/>
+          <w:noProof/>
+          <w:lang w:val="en-US"/>
+        </w:rPr>
+      </w:pPr>
+      <w:hyperlink w:anchor="_Toc232625722" w:history="1">
+        <w:r>
+          <w:rPr>
+            <w:rStyle w:val="Hyperlink"/>
+            <w:noProof/>
+            <w:lang w:val="en-US"/>
+          </w:rPr>
+          <w:t>PHỤ LỤC</w:t>
+        </w:r>
+        <w:r>
+          <w:rPr>
+            <w:noProof/>
+            <w:webHidden/>
+          </w:rPr>
+          <w:tab/>
+        </w:r>
+        <w:r>
+          <w:rPr>
+            <w:noProof/>
+            <w:webHidden/>
+          </w:rPr>
+          <w:fldChar w:fldCharType="begin"/>
+        </w:r>
+        <w:r>
+          <w:rPr>
+            <w:noProof/>
+            <w:webHidden/>
+          </w:rPr>
+          <w:instrText xml:space="preserve"> PAGEREF _Toc232625722 \h </w:instrText>
+        </w:r>
+        <w:r>
+          <w:rPr>
+            <w:noProof/>
+            <w:webHidden/>
+          </w:rPr>
+        </w:r>
+        <w:r>
+          <w:rPr>
+            <w:noProof/>
+            <w:webHidden/>
+          </w:rPr>
+          <w:fldChar w:fldCharType="separate"/>
+        </w:r>
+        <w:r>
+          <w:rPr>
+            <w:noProof/>
+            <w:webHidden/>
+          </w:rPr>
+          <w:t>57</w:t>
+        </w:r>
+        <w:r>
+          <w:rPr>
+            <w:noProof/>
+            <w:webHidden/>
+          </w:rPr>
+          <w:fldChar w:fldCharType="end"/>
+        </w:r>
+      </w:hyperlink>
+    </w:p>
+    <w:p>
+      <w:pPr>
+        <w:pStyle w:val="TOC3"/>
+        <w:tabs>
+          <w:tab w:val="right" w:leader="dot" w:pos="9063"/>
+        </w:tabs>
+        <w:rPr>
+          <w:rFonts w:asciiTheme="minorHAnsi" w:eastAsiaTheme="minorEastAsia" w:hAnsiTheme="minorHAnsi" w:cstheme="minorBidi"/>
+          <w:noProof/>
+          <w:lang w:val="en-US"/>
+        </w:rPr>
+      </w:pPr>
+      <w:hyperlink w:anchor="_Toc232625723" w:history="1">
+        <w:r>
+          <w:rPr>
+            <w:rStyle w:val="Hyperlink"/>
+            <w:noProof/>
+            <w:lang w:val="en-US"/>
+          </w:rPr>
+          <w:t>Link mã nguồn tại github: https://github.com/trungnt2026/build_chat_official</w:t>
+        </w:r>
+        <w:r>
+          <w:rPr>
+            <w:noProof/>
+            <w:webHidden/>
+          </w:rPr>
+          <w:tab/>
+        </w:r>
+        <w:r>
+          <w:rPr>
+            <w:noProof/>
+            <w:webHidden/>
+          </w:rPr>
+          <w:fldChar w:fldCharType="begin"/>
+        </w:r>
+        <w:r>
+          <w:rPr>
+            <w:noProof/>
+            <w:webHidden/>
+          </w:rPr>
+          <w:instrText xml:space="preserve"> PAGEREF _Toc232625723 \h </w:instrText>
+        </w:r>
+        <w:r>
+          <w:rPr>
+            <w:noProof/>
+            <w:webHidden/>
+          </w:rPr>
+        </w:r>
+        <w:r>
+          <w:rPr>
+            <w:noProof/>
+            <w:webHidden/>
+          </w:rPr>
+          <w:fldChar w:fldCharType="separate"/>
+        </w:r>
+        <w:r>
+          <w:rPr>
+            <w:noProof/>
+            <w:webHidden/>
+          </w:rPr>
+          <w:t>57</w:t>
+        </w:r>
+        <w:r>
+          <w:rPr>
+            <w:noProof/>
+            <w:webHidden/>
+          </w:rPr>
+          <w:fldChar w:fldCharType="end"/>
+        </w:r>
+      </w:hyperlink>
+    </w:p>
+    <w:p>
+      <w:pPr>
+        <w:pStyle w:val="TOC3"/>
+        <w:tabs>
+          <w:tab w:val="right" w:leader="dot" w:pos="9063"/>
+        </w:tabs>
+        <w:rPr>
+          <w:rFonts w:asciiTheme="minorHAnsi" w:eastAsiaTheme="minorEastAsia" w:hAnsiTheme="minorHAnsi" w:cstheme="minorBidi"/>
+          <w:noProof/>
+          <w:lang w:val="en-US"/>
+        </w:rPr>
+      </w:pPr>
+      <w:hyperlink w:anchor="_Toc232625724" w:history="1">
+        <w:r>
+          <w:rPr>
+            <w:rStyle w:val="Hyperlink"/>
+            <w:noProof/>
+            <w:lang w:val="en-US"/>
+          </w:rPr>
           <w:t>Link hướng dẫn sử dụng và thực thi mã nguồn</w:t>
         </w:r>
         <w:r>
@@ -10792,7 +11026,7 @@
             <w:noProof/>
             <w:webHidden/>
           </w:rPr>
-          <w:instrText xml:space="preserve"> PAGEREF _Toc232624585 \h </w:instrText>
+          <w:instrText xml:space="preserve"> PAGEREF _Toc232625724 \h </w:instrText>
         </w:r>
         <w:r>
           <w:rPr>
@@ -10812,7 +11046,7 @@
             <w:noProof/>
             <w:webHidden/>
           </w:rPr>
-          <w:t>60</w:t>
+          <w:t>57</w:t>
         </w:r>
         <w:r>
           <w:rPr>
@@ -10842,7 +11076,7 @@
           <w:lang w:val="en-US"/>
         </w:rPr>
       </w:pPr>
-      <w:bookmarkStart w:id="5" w:name="_Toc232624494"/>
+      <w:bookmarkStart w:id="5" w:name="_Toc232625630"/>
       <w:r>
         <w:rPr>
           <w:sz w:val="26"/>
@@ -11822,7 +12056,7 @@
           <w:lang w:val="en-US"/>
         </w:rPr>
       </w:pPr>
-      <w:bookmarkStart w:id="6" w:name="_Toc232624495"/>
+      <w:bookmarkStart w:id="6" w:name="_Toc232625631"/>
       <w:r>
         <w:rPr>
           <w:sz w:val="26"/>
@@ -12446,7 +12680,7 @@
           <w:szCs w:val="26"/>
         </w:rPr>
       </w:pPr>
-      <w:bookmarkStart w:id="7" w:name="_Toc232624496"/>
+      <w:bookmarkStart w:id="7" w:name="_Toc232625632"/>
       <w:r>
         <w:rPr>
           <w:sz w:val="26"/>
@@ -12490,6 +12724,7 @@
                 <w:sz w:val="22"/>
                 <w:szCs w:val="22"/>
               </w:rPr>
+              <w:lastRenderedPageBreak/>
               <w:t>Từ viết tắt</w:t>
             </w:r>
           </w:p>
@@ -12591,7 +12826,6 @@
                 <w:szCs w:val="22"/>
                 <w:lang w:val="en-US"/>
               </w:rPr>
-              <w:lastRenderedPageBreak/>
               <w:t>I/O</w:t>
             </w:r>
           </w:p>
@@ -13079,7 +13313,7 @@
           <w:lang w:val="en-US"/>
         </w:rPr>
       </w:pPr>
-      <w:bookmarkStart w:id="9" w:name="_Toc232624497"/>
+      <w:bookmarkStart w:id="9" w:name="_Toc232625633"/>
       <w:r>
         <w:rPr>
           <w:sz w:val="26"/>
@@ -13186,7 +13420,16 @@
           <w:szCs w:val="26"/>
           <w:lang w:val="en-US"/>
         </w:rPr>
-        <w:t xml:space="preserve"> chạy song song để đảm bảo việc nhập và nhận thông điệp diễn ra liên tục. Giao diện người dùng được xây dựng tối giản, tối ưu tốc độ thông qua giao diện dòng lệnh (Console/CLI) và mã hóa ký tự chuẩn UTF-8 tránh lỗi hiển thị tiếng Việt. Kết quả đồ án đạt được cấu trúc nền tảng vững chắc phục vụ cho bài toán lập trình mạng thế hệ mới. </w:t>
+        <w:t xml:space="preserve"> chạy song song để đảm bảo việc nhập và nhận thông điệp diễn ra liên tục. Giao diện người dùng được xây dựng tối giản, tối ưu tốc độ </w:t>
+      </w:r>
+      <w:r>
+        <w:rPr>
+          <w:sz w:val="26"/>
+          <w:szCs w:val="26"/>
+          <w:lang w:val="en-US"/>
+        </w:rPr>
+        <w:lastRenderedPageBreak/>
+        <w:t xml:space="preserve">thông qua giao diện dòng lệnh (Console/CLI) và mã hóa ký tự chuẩn UTF-8 tránh lỗi hiển thị tiếng Việt. Kết quả đồ án đạt được cấu trúc nền tảng vững chắc phục vụ cho bài toán lập trình mạng thế hệ mới. </w:t>
       </w:r>
     </w:p>
     <w:p>
@@ -13209,7 +13452,7 @@
         </w:rPr>
       </w:pPr>
       <w:bookmarkStart w:id="10" w:name="CHƯƠNG_1:_MỞ_ĐẦU"/>
-      <w:bookmarkStart w:id="11" w:name="_Toc232624498"/>
+      <w:bookmarkStart w:id="11" w:name="_Toc232625634"/>
       <w:bookmarkEnd w:id="10"/>
       <w:r>
         <w:rPr>
@@ -13299,7 +13542,7 @@
         </w:rPr>
       </w:pPr>
       <w:bookmarkStart w:id="12" w:name="1.1._Đặt_vấn_đề_(Lý_do_chọn_đề_tài)"/>
-      <w:bookmarkStart w:id="13" w:name="_Toc232624499"/>
+      <w:bookmarkStart w:id="13" w:name="_Toc232625635"/>
       <w:bookmarkEnd w:id="12"/>
       <w:r>
         <w:rPr>
@@ -13579,6 +13822,7 @@
           <w:szCs w:val="26"/>
           <w:lang w:val="en-US"/>
         </w:rPr>
+        <w:lastRenderedPageBreak/>
         <w:t>Bài toán định tuyến thông điệp chính xác:</w:t>
       </w:r>
       <w:r>
@@ -13615,7 +13859,6 @@
           <w:szCs w:val="26"/>
           <w:lang w:val="en-US"/>
         </w:rPr>
-        <w:lastRenderedPageBreak/>
         <w:t>An toàn về phân luồng bộ nhớ (Thread-safety):</w:t>
       </w:r>
       <w:r>
@@ -13704,7 +13947,7 @@
         </w:rPr>
       </w:pPr>
       <w:bookmarkStart w:id="14" w:name="1.2._Mục_tiêu_của_đề_tài"/>
-      <w:bookmarkStart w:id="15" w:name="_Toc232624500"/>
+      <w:bookmarkStart w:id="15" w:name="_Toc232625636"/>
       <w:bookmarkEnd w:id="14"/>
       <w:r>
         <w:rPr>
@@ -13781,7 +14024,7 @@
         <w:pStyle w:val="Heading5"/>
         <w:spacing w:line="360" w:lineRule="auto"/>
       </w:pPr>
-      <w:bookmarkStart w:id="16" w:name="_Toc232624501"/>
+      <w:bookmarkStart w:id="16" w:name="_Toc232625637"/>
       <w:r>
         <w:rPr>
           <w:lang w:val="en-US"/>
@@ -13999,6 +14242,7 @@
           <w:sz w:val="26"/>
           <w:szCs w:val="26"/>
         </w:rPr>
+        <w:lastRenderedPageBreak/>
         <w:t></w:t>
       </w:r>
       <w:r>
@@ -14039,7 +14283,6 @@
           <w:sz w:val="26"/>
           <w:szCs w:val="26"/>
         </w:rPr>
-        <w:lastRenderedPageBreak/>
         <w:t></w:t>
       </w:r>
       <w:r>
@@ -14061,7 +14304,7 @@
         <w:pStyle w:val="Heading5"/>
         <w:spacing w:line="360" w:lineRule="auto"/>
       </w:pPr>
-      <w:bookmarkStart w:id="17" w:name="_Toc232624502"/>
+      <w:bookmarkStart w:id="17" w:name="_Toc232625638"/>
       <w:r>
         <w:rPr>
           <w:lang w:val="en-US"/>
@@ -14579,7 +14822,7 @@
         </w:rPr>
       </w:pPr>
       <w:bookmarkStart w:id="18" w:name="1.3._Đối_tượng_và_phạm_vi_nghiên_cứu"/>
-      <w:bookmarkStart w:id="19" w:name="_Toc232624503"/>
+      <w:bookmarkStart w:id="19" w:name="_Toc232625639"/>
       <w:bookmarkEnd w:id="18"/>
       <w:r>
         <w:rPr>
@@ -14958,7 +15201,7 @@
       </w:pPr>
       <w:bookmarkStart w:id="20" w:name="1.4._Phương_pháp_nghiên_cứu"/>
       <w:bookmarkStart w:id="21" w:name="1.5._Cấu_trúc_của_đồ_án"/>
-      <w:bookmarkStart w:id="22" w:name="_Toc232624504"/>
+      <w:bookmarkStart w:id="22" w:name="_Toc232625640"/>
       <w:bookmarkEnd w:id="20"/>
       <w:bookmarkEnd w:id="21"/>
       <w:r>
@@ -14992,7 +15235,7 @@
         <w:pStyle w:val="Heading5"/>
         <w:spacing w:line="360" w:lineRule="auto"/>
       </w:pPr>
-      <w:bookmarkStart w:id="23" w:name="_Toc232624505"/>
+      <w:bookmarkStart w:id="23" w:name="_Toc232625641"/>
       <w:r>
         <w:t>1.4.1. Phương pháp nghiên cứu lý thuyết (Theoretical Research)</w:t>
       </w:r>
@@ -15184,7 +15427,7 @@
         <w:pStyle w:val="Heading5"/>
         <w:spacing w:line="360" w:lineRule="auto"/>
       </w:pPr>
-      <w:bookmarkStart w:id="24" w:name="_Toc232624506"/>
+      <w:bookmarkStart w:id="24" w:name="_Toc232625642"/>
       <w:r>
         <w:t>1.4.2. Phương pháp phân tích và thiết kế hệ thống (System Analysis and Design)</w:t>
       </w:r>
@@ -15477,7 +15720,7 @@
         <w:pStyle w:val="Heading5"/>
         <w:spacing w:line="360" w:lineRule="auto"/>
       </w:pPr>
-      <w:bookmarkStart w:id="25" w:name="_Toc232624507"/>
+      <w:bookmarkStart w:id="25" w:name="_Toc232625643"/>
       <w:r>
         <w:t>1.4.3. Phương pháp thực nghiệm phần mềm (Empirical Software Engineering)</w:t>
       </w:r>
@@ -15622,7 +15865,7 @@
           <w:lang w:val="en-US"/>
         </w:rPr>
       </w:pPr>
-      <w:bookmarkStart w:id="26" w:name="_Toc232624508"/>
+      <w:bookmarkStart w:id="26" w:name="_Toc232625644"/>
       <w:r>
         <w:rPr>
           <w:lang w:val="en-US"/>
@@ -15639,7 +15882,7 @@
           <w:lang w:val="en-US"/>
         </w:rPr>
       </w:pPr>
-      <w:bookmarkStart w:id="27" w:name="_Toc232624509"/>
+      <w:bookmarkStart w:id="27" w:name="_Toc232625645"/>
       <w:r>
         <w:rPr>
           <w:lang w:val="en-US"/>
@@ -15716,7 +15959,7 @@
           <w:lang w:val="en-US"/>
         </w:rPr>
       </w:pPr>
-      <w:bookmarkStart w:id="28" w:name="_Toc232624510"/>
+      <w:bookmarkStart w:id="28" w:name="_Toc232625646"/>
       <w:r>
         <w:rPr>
           <w:lang w:val="en-US"/>
@@ -15800,7 +16043,7 @@
         </w:rPr>
       </w:pPr>
       <w:bookmarkStart w:id="29" w:name="CHƯƠNG_2:_CƠ_SỞ_LÝ_THUYẾT_VÀ_CÔNG_NGHỆ_S"/>
-      <w:bookmarkStart w:id="30" w:name="_Toc232624511"/>
+      <w:bookmarkStart w:id="30" w:name="_Toc232625647"/>
       <w:bookmarkEnd w:id="29"/>
       <w:r>
         <w:rPr>
@@ -16010,7 +16253,7 @@
         </w:rPr>
       </w:pPr>
       <w:bookmarkStart w:id="31" w:name="2.1._Tổng_quan_về_các_hệ_thống_trò_chuyệ"/>
-      <w:bookmarkStart w:id="32" w:name="_Toc232624512"/>
+      <w:bookmarkStart w:id="32" w:name="_Toc232625648"/>
       <w:bookmarkEnd w:id="31"/>
       <w:r>
         <w:rPr>
@@ -16203,7 +16446,7 @@
         </w:rPr>
       </w:pPr>
       <w:bookmarkStart w:id="33" w:name="2.1.1._Mô_hình_kiến_trúc_mạng_trong_ứng_"/>
-      <w:bookmarkStart w:id="34" w:name="_Toc232624513"/>
+      <w:bookmarkStart w:id="34" w:name="_Toc232625649"/>
       <w:bookmarkEnd w:id="33"/>
       <w:r>
         <w:rPr>
@@ -16880,7 +17123,7 @@
         </w:rPr>
       </w:pPr>
       <w:bookmarkStart w:id="35" w:name="2.1.2._Thách_thức_trong_xây_dựng_hệ_thốn"/>
-      <w:bookmarkStart w:id="36" w:name="_Toc232624514"/>
+      <w:bookmarkStart w:id="36" w:name="_Toc232625650"/>
       <w:bookmarkEnd w:id="35"/>
       <w:r>
         <w:rPr>
@@ -17082,7 +17325,7 @@
         </w:rPr>
       </w:pPr>
       <w:bookmarkStart w:id="37" w:name="2.2._Giao_thức_truyền_tải_thời_gian_thực"/>
-      <w:bookmarkStart w:id="38" w:name="_Toc232624515"/>
+      <w:bookmarkStart w:id="38" w:name="_Toc232625651"/>
       <w:bookmarkEnd w:id="37"/>
       <w:r>
         <w:rPr>
@@ -17213,7 +17456,7 @@
         </w:rPr>
       </w:pPr>
       <w:bookmarkStart w:id="39" w:name="2.2.1._Giao_thức_HTTP_Polling_và_Long_Po"/>
-      <w:bookmarkStart w:id="40" w:name="_Toc232624516"/>
+      <w:bookmarkStart w:id="40" w:name="_Toc232625652"/>
       <w:bookmarkEnd w:id="39"/>
       <w:r>
         <w:rPr>
@@ -17639,7 +17882,7 @@
         </w:rPr>
       </w:pPr>
       <w:bookmarkStart w:id="41" w:name="2.2.2._Giao_thức_WebSocket"/>
-      <w:bookmarkStart w:id="42" w:name="_Toc232624517"/>
+      <w:bookmarkStart w:id="42" w:name="_Toc232625653"/>
       <w:bookmarkEnd w:id="41"/>
       <w:r>
         <w:rPr>
@@ -17933,7 +18176,7 @@
           <w:rFonts w:asciiTheme="majorHAnsi" w:hAnsiTheme="majorHAnsi" w:cstheme="majorHAnsi"/>
         </w:rPr>
       </w:pPr>
-      <w:bookmarkStart w:id="43" w:name="_Toc232624518"/>
+      <w:bookmarkStart w:id="43" w:name="_Toc232625654"/>
       <w:r>
         <w:rPr>
           <w:rFonts w:asciiTheme="majorHAnsi" w:hAnsiTheme="majorHAnsi" w:cstheme="majorHAnsi"/>
@@ -18522,7 +18765,7 @@
           <w:lang w:val="en-US"/>
         </w:rPr>
       </w:pPr>
-      <w:bookmarkStart w:id="44" w:name="_Toc232624519"/>
+      <w:bookmarkStart w:id="44" w:name="_Toc232625655"/>
       <w:r>
         <w:rPr>
           <w:lang w:val="en-US"/>
@@ -18802,7 +19045,7 @@
           <w:lang w:val="en-US"/>
         </w:rPr>
       </w:pPr>
-      <w:bookmarkStart w:id="45" w:name="_Toc232624520"/>
+      <w:bookmarkStart w:id="45" w:name="_Toc232625656"/>
       <w:r>
         <w:t>Giao thức Socket trong Java</w:t>
       </w:r>
@@ -18817,7 +19060,7 @@
           <w:szCs w:val="26"/>
         </w:rPr>
       </w:pPr>
-      <w:bookmarkStart w:id="46" w:name="_Toc232624521"/>
+      <w:bookmarkStart w:id="46" w:name="_Toc232625657"/>
       <w:r>
         <w:rPr>
           <w:sz w:val="26"/>
@@ -19263,7 +19506,7 @@
           <w:szCs w:val="26"/>
         </w:rPr>
       </w:pPr>
-      <w:bookmarkStart w:id="47" w:name="_Toc232624522"/>
+      <w:bookmarkStart w:id="47" w:name="_Toc232625658"/>
       <w:r>
         <w:rPr>
           <w:rFonts w:hAnsi="Symbol"/>
@@ -19959,7 +20202,7 @@
           <w:szCs w:val="26"/>
         </w:rPr>
       </w:pPr>
-      <w:bookmarkStart w:id="48" w:name="_Toc232624523"/>
+      <w:bookmarkStart w:id="48" w:name="_Toc232625659"/>
       <w:r>
         <w:rPr>
           <w:rFonts w:hAnsi="Symbol"/>
@@ -20495,7 +20738,7 @@
           <w:szCs w:val="26"/>
         </w:rPr>
       </w:pPr>
-      <w:bookmarkStart w:id="49" w:name="_Toc232624524"/>
+      <w:bookmarkStart w:id="49" w:name="_Toc232625660"/>
       <w:r>
         <w:rPr>
           <w:rFonts w:hAnsi="Symbol"/>
@@ -21045,7 +21288,7 @@
           <w:lang w:val="en-US"/>
         </w:rPr>
       </w:pPr>
-      <w:bookmarkStart w:id="50" w:name="_Toc232624525"/>
+      <w:bookmarkStart w:id="50" w:name="_Toc232625661"/>
       <w:r>
         <w:t>Luồng vào ra (I/O Streams)</w:t>
       </w:r>
@@ -21070,7 +21313,7 @@
           <w:szCs w:val="26"/>
         </w:rPr>
       </w:pPr>
-      <w:bookmarkStart w:id="51" w:name="_Toc232624526"/>
+      <w:bookmarkStart w:id="51" w:name="_Toc232625662"/>
       <w:r>
         <w:rPr>
           <w:rFonts w:hAnsi="Symbol"/>
@@ -21737,7 +21980,7 @@
           <w:szCs w:val="26"/>
         </w:rPr>
       </w:pPr>
-      <w:bookmarkStart w:id="53" w:name="_Toc232624527"/>
+      <w:bookmarkStart w:id="53" w:name="_Toc232625663"/>
       <w:r>
         <w:rPr>
           <w:sz w:val="26"/>
@@ -22446,7 +22689,7 @@
           <w:szCs w:val="26"/>
         </w:rPr>
       </w:pPr>
-      <w:bookmarkStart w:id="55" w:name="_Toc232624528"/>
+      <w:bookmarkStart w:id="55" w:name="_Toc232625664"/>
       <w:r>
         <w:rPr>
           <w:sz w:val="26"/>
@@ -23468,7 +23711,7 @@
           <w:szCs w:val="26"/>
         </w:rPr>
       </w:pPr>
-      <w:bookmarkStart w:id="57" w:name="_Toc232624529"/>
+      <w:bookmarkStart w:id="57" w:name="_Toc232625665"/>
       <w:r>
         <w:rPr>
           <w:rFonts w:hAnsi="Symbol"/>
@@ -24548,7 +24791,7 @@
           <w:lang w:val="en-US"/>
         </w:rPr>
       </w:pPr>
-      <w:bookmarkStart w:id="60" w:name="_Toc232624530"/>
+      <w:bookmarkStart w:id="60" w:name="_Toc232625666"/>
       <w:r>
         <w:t>NGHIÊN CỨU VỀ NGÔN NGỮ LẬP TRÌNH JAVA</w:t>
       </w:r>
@@ -24563,7 +24806,7 @@
           <w:szCs w:val="26"/>
         </w:rPr>
       </w:pPr>
-      <w:bookmarkStart w:id="61" w:name="_Toc232624531"/>
+      <w:bookmarkStart w:id="61" w:name="_Toc232625667"/>
       <w:r>
         <w:rPr>
           <w:sz w:val="26"/>
@@ -24734,7 +24977,7 @@
           <w:szCs w:val="26"/>
         </w:rPr>
       </w:pPr>
-      <w:bookmarkStart w:id="62" w:name="_Toc232624532"/>
+      <w:bookmarkStart w:id="62" w:name="_Toc232625668"/>
       <w:r>
         <w:rPr>
           <w:sz w:val="26"/>
@@ -24869,7 +25112,7 @@
         <w:pStyle w:val="NoSpacing"/>
         <w:spacing w:line="360" w:lineRule="auto"/>
       </w:pPr>
-      <w:bookmarkStart w:id="63" w:name="_Toc232624533"/>
+      <w:bookmarkStart w:id="63" w:name="_Toc232625669"/>
       <w:r>
         <w:rPr>
           <w:sz w:val="26"/>
@@ -25054,7 +25297,7 @@
         </w:rPr>
       </w:pPr>
       <w:bookmarkStart w:id="64" w:name="2.3._Các_công_nghệ_và_công_cụ_phát_triển"/>
-      <w:bookmarkStart w:id="65" w:name="_Toc232624534"/>
+      <w:bookmarkStart w:id="65" w:name="_Toc232625670"/>
       <w:bookmarkEnd w:id="64"/>
       <w:r>
         <w:rPr>
@@ -25206,7 +25449,7 @@
         </w:rPr>
       </w:pPr>
       <w:bookmarkStart w:id="66" w:name="2.3.1._Ngôn_ngữ_lập_trình_và_Framework_p"/>
-      <w:bookmarkStart w:id="67" w:name="_Toc232624535"/>
+      <w:bookmarkStart w:id="67" w:name="_Toc232625671"/>
       <w:bookmarkEnd w:id="66"/>
       <w:r>
         <w:rPr>
@@ -25306,7 +25549,7 @@
         </w:rPr>
       </w:pPr>
       <w:bookmarkStart w:id="68" w:name="2.3.2._Framework/Thư_viện_phía_Front-end"/>
-      <w:bookmarkStart w:id="69" w:name="_Toc232624536"/>
+      <w:bookmarkStart w:id="69" w:name="_Toc232625672"/>
       <w:bookmarkEnd w:id="68"/>
       <w:r>
         <w:rPr>
@@ -25506,7 +25749,7 @@
           <w:lang w:val="en-US"/>
         </w:rPr>
       </w:pPr>
-      <w:bookmarkStart w:id="72" w:name="_Toc232624537"/>
+      <w:bookmarkStart w:id="72" w:name="_Toc232625673"/>
       <w:r>
         <w:rPr>
           <w:lang w:val="en-US" w:eastAsia="vi-VN"/>
@@ -25532,7 +25775,7 @@
           <w:lang w:val="en-US" w:eastAsia="vi-VN"/>
         </w:rPr>
       </w:pPr>
-      <w:bookmarkStart w:id="73" w:name="_Toc232624538"/>
+      <w:bookmarkStart w:id="73" w:name="_Toc232625674"/>
       <w:r>
         <w:rPr>
           <w:lang w:val="en-US" w:eastAsia="vi-VN"/>
@@ -25729,7 +25972,7 @@
           <w:lang w:val="en-US"/>
         </w:rPr>
       </w:pPr>
-      <w:bookmarkStart w:id="74" w:name="_Toc232624539"/>
+      <w:bookmarkStart w:id="74" w:name="_Toc232625675"/>
       <w:r>
         <w:rPr>
           <w:lang w:val="en-US"/>
@@ -25927,7 +26170,7 @@
           <w:lang w:val="en-US"/>
         </w:rPr>
       </w:pPr>
-      <w:bookmarkStart w:id="75" w:name="_Toc232624540"/>
+      <w:bookmarkStart w:id="75" w:name="_Toc232625676"/>
       <w:r>
         <w:rPr>
           <w:lang w:val="en-US"/>
@@ -25992,7 +26235,7 @@
         </w:rPr>
       </w:pPr>
       <w:bookmarkStart w:id="76" w:name="CHƯƠNG_3:_PHÂN_TÍCH_VÀ_THIẾT_KẾ_HỆ_THỐNG"/>
-      <w:bookmarkStart w:id="77" w:name="_Toc232624541"/>
+      <w:bookmarkStart w:id="77" w:name="_Toc232625677"/>
       <w:bookmarkEnd w:id="76"/>
       <w:r>
         <w:rPr>
@@ -26148,7 +26391,7 @@
         <w:spacing w:line="360" w:lineRule="auto"/>
       </w:pPr>
       <w:bookmarkStart w:id="78" w:name="3.1._Phân_tích_yêu_cầu_hệ_thống_(Require"/>
-      <w:bookmarkStart w:id="79" w:name="_Toc232624542"/>
+      <w:bookmarkStart w:id="79" w:name="_Toc232625678"/>
       <w:bookmarkEnd w:id="78"/>
       <w:r>
         <w:rPr>
@@ -26553,7 +26796,7 @@
         </w:rPr>
       </w:pPr>
       <w:bookmarkStart w:id="80" w:name="3.1.1._Yêu_cầu_chức_năng_(Functional_Req"/>
-      <w:bookmarkStart w:id="81" w:name="_Toc232624543"/>
+      <w:bookmarkStart w:id="81" w:name="_Toc232625679"/>
       <w:bookmarkEnd w:id="80"/>
       <w:r>
         <w:rPr>
@@ -27322,7 +27565,7 @@
         <w:pStyle w:val="Heading5"/>
         <w:spacing w:line="360" w:lineRule="auto"/>
       </w:pPr>
-      <w:bookmarkStart w:id="83" w:name="_Toc232624544"/>
+      <w:bookmarkStart w:id="83" w:name="_Toc232625680"/>
       <w:r>
         <w:rPr>
           <w:lang w:val="en-US"/>
@@ -27341,6 +27584,7 @@
         <w:pStyle w:val="BodyText"/>
         <w:keepNext/>
         <w:spacing w:line="360" w:lineRule="auto"/>
+        <w:jc w:val="center"/>
       </w:pPr>
       <w:r>
         <w:rPr>
@@ -27349,9 +27593,9 @@
         </w:rPr>
         <w:lastRenderedPageBreak/>
         <w:drawing>
-          <wp:inline distT="0" distB="0" distL="0" distR="0" wp14:anchorId="1D49FCD2" wp14:editId="60D17F6E">
-            <wp:extent cx="6470650" cy="6994566"/>
-            <wp:effectExtent l="0" t="0" r="6350" b="0"/>
+          <wp:inline distT="0" distB="0" distL="0" distR="0" wp14:anchorId="1D49FCD2" wp14:editId="2570D941">
+            <wp:extent cx="5130165" cy="4699591"/>
+            <wp:effectExtent l="0" t="0" r="0" b="6350"/>
             <wp:docPr id="18" name="Picture 18"/>
             <wp:cNvGraphicFramePr>
               <a:graphicFrameLocks xmlns:a="http://schemas.openxmlformats.org/drawingml/2006/main" noChangeAspect="1"/>
@@ -27378,7 +27622,7 @@
                   <pic:spPr>
                     <a:xfrm>
                       <a:off x="0" y="0"/>
-                      <a:ext cx="6536046" cy="7065257"/>
+                      <a:ext cx="5197359" cy="4761146"/>
                     </a:xfrm>
                     <a:prstGeom prst="rect">
                       <a:avLst/>
@@ -27515,7 +27759,7 @@
           <w:lang w:val="en-US"/>
         </w:rPr>
       </w:pPr>
-      <w:bookmarkStart w:id="86" w:name="_Toc232624545"/>
+      <w:bookmarkStart w:id="86" w:name="_Toc232625681"/>
       <w:r>
         <w:rPr>
           <w:lang w:val="en-US"/>
@@ -27541,6 +27785,7 @@
         <w:pStyle w:val="BodyText"/>
         <w:keepNext/>
         <w:spacing w:line="360" w:lineRule="auto"/>
+        <w:jc w:val="center"/>
       </w:pPr>
       <w:r>
         <w:rPr>
@@ -27549,9 +27794,9 @@
         </w:rPr>
         <w:lastRenderedPageBreak/>
         <w:drawing>
-          <wp:inline distT="0" distB="0" distL="0" distR="0" wp14:anchorId="0F8E38D7" wp14:editId="78CA8AB3">
-            <wp:extent cx="5165766" cy="4999128"/>
-            <wp:effectExtent l="0" t="0" r="0" b="0"/>
+          <wp:inline distT="0" distB="0" distL="0" distR="0" wp14:anchorId="0F8E38D7" wp14:editId="36736E6E">
+            <wp:extent cx="2985358" cy="2889056"/>
+            <wp:effectExtent l="0" t="0" r="5715" b="6985"/>
             <wp:docPr id="19" name="Picture 19"/>
             <wp:cNvGraphicFramePr>
               <a:graphicFrameLocks xmlns:a="http://schemas.openxmlformats.org/drawingml/2006/main" noChangeAspect="1"/>
@@ -27578,7 +27823,7 @@
                   <pic:spPr>
                     <a:xfrm>
                       <a:off x="0" y="0"/>
-                      <a:ext cx="5181372" cy="5014230"/>
+                      <a:ext cx="3005923" cy="2908958"/>
                     </a:xfrm>
                     <a:prstGeom prst="rect">
                       <a:avLst/>
@@ -27641,7 +27886,7 @@
           <w:lang w:val="en-US"/>
         </w:rPr>
       </w:pPr>
-      <w:bookmarkStart w:id="87" w:name="_Toc232624546"/>
+      <w:bookmarkStart w:id="87" w:name="_Toc232625682"/>
       <w:r>
         <w:rPr>
           <w:lang w:val="en-US"/>
@@ -27658,16 +27903,16 @@
         <w:pStyle w:val="BodyText"/>
         <w:keepNext/>
         <w:spacing w:line="360" w:lineRule="auto"/>
+        <w:jc w:val="center"/>
       </w:pPr>
       <w:r>
         <w:rPr>
           <w:noProof/>
           <w:lang w:val="en-US"/>
         </w:rPr>
-        <w:lastRenderedPageBreak/>
         <w:drawing>
-          <wp:inline distT="0" distB="0" distL="0" distR="0" wp14:anchorId="38A8F001" wp14:editId="1E256A7C">
-            <wp:extent cx="5854065" cy="4215740"/>
+          <wp:inline distT="0" distB="0" distL="0" distR="0" wp14:anchorId="38A8F001" wp14:editId="70EE2382">
+            <wp:extent cx="2710683" cy="1952068"/>
             <wp:effectExtent l="0" t="0" r="0" b="0"/>
             <wp:docPr id="20" name="Picture 20"/>
             <wp:cNvGraphicFramePr>
@@ -27695,7 +27940,7 @@
                   <pic:spPr>
                     <a:xfrm>
                       <a:off x="0" y="0"/>
-                      <a:ext cx="5892251" cy="4243239"/>
+                      <a:ext cx="2741776" cy="1974459"/>
                     </a:xfrm>
                     <a:prstGeom prst="rect">
                       <a:avLst/>
@@ -27750,7 +27995,7 @@
           <w:lang w:val="en-US"/>
         </w:rPr>
       </w:pPr>
-      <w:bookmarkStart w:id="88" w:name="_Toc232624547"/>
+      <w:bookmarkStart w:id="88" w:name="_Toc232625683"/>
       <w:r>
         <w:rPr>
           <w:lang w:val="en-US"/>
@@ -27767,6 +28012,7 @@
         <w:pStyle w:val="BodyText"/>
         <w:keepNext/>
         <w:spacing w:line="360" w:lineRule="auto"/>
+        <w:jc w:val="center"/>
       </w:pPr>
       <w:r>
         <w:rPr>
@@ -27775,9 +28021,9 @@
         </w:rPr>
         <w:lastRenderedPageBreak/>
         <w:drawing>
-          <wp:inline distT="0" distB="0" distL="0" distR="0" wp14:anchorId="75A29C58" wp14:editId="1AE2D208">
-            <wp:extent cx="5795010" cy="6068291"/>
-            <wp:effectExtent l="0" t="0" r="0" b="8890"/>
+          <wp:inline distT="0" distB="0" distL="0" distR="0" wp14:anchorId="75A29C58" wp14:editId="3B1F1FD8">
+            <wp:extent cx="2937831" cy="3076375"/>
+            <wp:effectExtent l="0" t="0" r="0" b="0"/>
             <wp:docPr id="21" name="Picture 21"/>
             <wp:cNvGraphicFramePr>
               <a:graphicFrameLocks xmlns:a="http://schemas.openxmlformats.org/drawingml/2006/main" noChangeAspect="1"/>
@@ -27804,7 +28050,7 @@
                   <pic:spPr>
                     <a:xfrm>
                       <a:off x="0" y="0"/>
-                      <a:ext cx="5821283" cy="6095803"/>
+                      <a:ext cx="2970619" cy="3110709"/>
                     </a:xfrm>
                     <a:prstGeom prst="rect">
                       <a:avLst/>
@@ -27859,7 +28105,7 @@
           <w:lang w:val="en-US"/>
         </w:rPr>
       </w:pPr>
-      <w:bookmarkStart w:id="89" w:name="_Toc232624548"/>
+      <w:bookmarkStart w:id="89" w:name="_Toc232625684"/>
       <w:r>
         <w:rPr>
           <w:lang w:val="en-US"/>
@@ -27870,32 +28116,23 @@
         <w:t>Kiến trúc bên trong Client</w:t>
       </w:r>
       <w:bookmarkEnd w:id="89"/>
-    </w:p>
-    <w:p>
-      <w:pPr>
-        <w:pStyle w:val="BodyText"/>
-        <w:spacing w:line="360" w:lineRule="auto"/>
-        <w:rPr>
-          <w:lang w:val="en-US"/>
-        </w:rPr>
-      </w:pPr>
     </w:p>
     <w:p>
       <w:pPr>
         <w:pStyle w:val="BodyText"/>
         <w:keepNext/>
         <w:spacing w:line="360" w:lineRule="auto"/>
+        <w:jc w:val="center"/>
       </w:pPr>
       <w:r>
         <w:rPr>
           <w:noProof/>
           <w:lang w:val="en-US"/>
         </w:rPr>
-        <w:lastRenderedPageBreak/>
         <w:drawing>
-          <wp:inline distT="0" distB="0" distL="0" distR="0" wp14:anchorId="30F460A4" wp14:editId="4462CB21">
-            <wp:extent cx="5747361" cy="4393870"/>
-            <wp:effectExtent l="0" t="0" r="6350" b="6985"/>
+          <wp:inline distT="0" distB="0" distL="0" distR="0" wp14:anchorId="30F460A4" wp14:editId="4AE4EE72">
+            <wp:extent cx="3343275" cy="2555941"/>
+            <wp:effectExtent l="0" t="0" r="0" b="0"/>
             <wp:docPr id="22" name="Picture 22"/>
             <wp:cNvGraphicFramePr>
               <a:graphicFrameLocks xmlns:a="http://schemas.openxmlformats.org/drawingml/2006/main" noChangeAspect="1"/>
@@ -27922,7 +28159,7 @@
                   <pic:spPr>
                     <a:xfrm>
                       <a:off x="0" y="0"/>
-                      <a:ext cx="5774971" cy="4414978"/>
+                      <a:ext cx="3373184" cy="2578807"/>
                     </a:xfrm>
                     <a:prstGeom prst="rect">
                       <a:avLst/>
@@ -27977,7 +28214,7 @@
           <w:lang w:val="en-US"/>
         </w:rPr>
       </w:pPr>
-      <w:bookmarkStart w:id="90" w:name="_Toc232624549"/>
+      <w:bookmarkStart w:id="90" w:name="_Toc232625685"/>
       <w:r>
         <w:rPr>
           <w:lang w:val="en-US"/>
@@ -28003,6 +28240,7 @@
         <w:pStyle w:val="BodyText"/>
         <w:keepNext/>
         <w:spacing w:line="360" w:lineRule="auto"/>
+        <w:jc w:val="center"/>
       </w:pPr>
       <w:r>
         <w:rPr>
@@ -28011,9 +28249,9 @@
         </w:rPr>
         <w:lastRenderedPageBreak/>
         <w:drawing>
-          <wp:inline distT="0" distB="0" distL="0" distR="0" wp14:anchorId="5C9D3BB4" wp14:editId="337700DD">
-            <wp:extent cx="5723414" cy="5284520"/>
-            <wp:effectExtent l="0" t="0" r="0" b="0"/>
+          <wp:inline distT="0" distB="0" distL="0" distR="0" wp14:anchorId="5C9D3BB4" wp14:editId="26436FBE">
+            <wp:extent cx="3415073" cy="3153191"/>
+            <wp:effectExtent l="0" t="0" r="0" b="9525"/>
             <wp:docPr id="23" name="Picture 23"/>
             <wp:cNvGraphicFramePr>
               <a:graphicFrameLocks xmlns:a="http://schemas.openxmlformats.org/drawingml/2006/main" noChangeAspect="1"/>
@@ -28040,7 +28278,7 @@
                   <pic:spPr>
                     <a:xfrm>
                       <a:off x="0" y="0"/>
-                      <a:ext cx="5743171" cy="5302762"/>
+                      <a:ext cx="3440282" cy="3176467"/>
                     </a:xfrm>
                     <a:prstGeom prst="rect">
                       <a:avLst/>
@@ -28178,7 +28416,7 @@
         </w:rPr>
       </w:pPr>
       <w:bookmarkStart w:id="91" w:name="CHƯƠNG_4:_CÀI_ĐẶT_VÀ_THỬ_NGHIỆM_HỆ_THỐNG"/>
-      <w:bookmarkStart w:id="92" w:name="_Toc232624550"/>
+      <w:bookmarkStart w:id="92" w:name="_Toc232625686"/>
       <w:bookmarkEnd w:id="91"/>
       <w:r>
         <w:rPr>
@@ -28327,7 +28565,7 @@
         </w:rPr>
       </w:pPr>
       <w:bookmarkStart w:id="93" w:name="4.1._Môi_trường_cài_đặt_phần_mềm"/>
-      <w:bookmarkStart w:id="94" w:name="_Toc232624551"/>
+      <w:bookmarkStart w:id="94" w:name="_Toc232625687"/>
       <w:bookmarkEnd w:id="93"/>
       <w:r>
         <w:rPr>
@@ -28529,7 +28767,7 @@
           <w:lang w:val="en-US"/>
         </w:rPr>
       </w:pPr>
-      <w:bookmarkStart w:id="95" w:name="_Toc232624552"/>
+      <w:bookmarkStart w:id="95" w:name="_Toc232625688"/>
       <w:r>
         <w:rPr>
           <w:lang w:val="en-US"/>
@@ -28616,7 +28854,7 @@
           <w:lang w:val="en-US"/>
         </w:rPr>
       </w:pPr>
-      <w:bookmarkStart w:id="96" w:name="_Toc232624553"/>
+      <w:bookmarkStart w:id="96" w:name="_Toc232625689"/>
       <w:r>
         <w:rPr>
           <w:lang w:val="en-US"/>
@@ -28705,7 +28943,7 @@
           <w:lang w:val="en-US"/>
         </w:rPr>
       </w:pPr>
-      <w:bookmarkStart w:id="97" w:name="_Toc232624554"/>
+      <w:bookmarkStart w:id="97" w:name="_Toc232625690"/>
       <w:r>
         <w:rPr>
           <w:lang w:val="en-US"/>
@@ -28833,7 +29071,7 @@
           <w:lang w:val="en-US"/>
         </w:rPr>
       </w:pPr>
-      <w:bookmarkStart w:id="98" w:name="_Toc232624555"/>
+      <w:bookmarkStart w:id="98" w:name="_Toc232625691"/>
       <w:r>
         <w:rPr>
           <w:lang w:val="en-US"/>
@@ -28920,7 +29158,7 @@
           <w:lang w:val="en-US"/>
         </w:rPr>
       </w:pPr>
-      <w:bookmarkStart w:id="99" w:name="_Toc232624556"/>
+      <w:bookmarkStart w:id="99" w:name="_Toc232625692"/>
       <w:r>
         <w:rPr>
           <w:lang w:val="en-US"/>
@@ -28971,7 +29209,7 @@
         <w:pStyle w:val="Heading5"/>
         <w:spacing w:line="360" w:lineRule="auto"/>
       </w:pPr>
-      <w:bookmarkStart w:id="100" w:name="_Toc232624557"/>
+      <w:bookmarkStart w:id="100" w:name="_Toc232625693"/>
       <w:r>
         <w:rPr>
           <w:lang w:val="en-US"/>
@@ -29107,7 +29345,7 @@
         </w:rPr>
       </w:pPr>
       <w:bookmarkStart w:id="101" w:name="4.2._Hiện_thực_hóa_các_mã_nguồn_cốt_lõi_"/>
-      <w:bookmarkStart w:id="102" w:name="_Toc232624558"/>
+      <w:bookmarkStart w:id="102" w:name="_Toc232625694"/>
       <w:bookmarkEnd w:id="101"/>
       <w:r>
         <w:rPr>
@@ -29138,7 +29376,7 @@
       <w:bookmarkStart w:id="104" w:name="4.2.2._Xử_lý_lưu_trữ_tin_nhắn_lịch_sử_bề"/>
       <w:bookmarkStart w:id="105" w:name="4.3._Kiểm_thử_hệ_thống_(Software_Testing"/>
       <w:bookmarkStart w:id="106" w:name="4.3.1._Kịch_bản_kiểm_thử_các_chức_năng_c"/>
-      <w:bookmarkStart w:id="107" w:name="_Toc232624559"/>
+      <w:bookmarkStart w:id="107" w:name="_Toc232625695"/>
       <w:bookmarkEnd w:id="103"/>
       <w:bookmarkEnd w:id="104"/>
       <w:bookmarkEnd w:id="105"/>
@@ -29693,7 +29931,7 @@
           <w:position w:val="1"/>
         </w:rPr>
       </w:pPr>
-      <w:bookmarkStart w:id="110" w:name="_Toc232624560"/>
+      <w:bookmarkStart w:id="110" w:name="_Toc232625696"/>
       <w:r>
         <w:rPr>
           <w:lang w:val="en-US"/>
@@ -30045,7 +30283,6 @@
         </w:tabs>
         <w:spacing w:before="63" w:line="360" w:lineRule="auto"/>
         <w:ind w:right="139"/>
-        <w:jc w:val="both"/>
         <w:rPr>
           <w:sz w:val="26"/>
           <w:szCs w:val="26"/>
@@ -30060,8 +30297,8 @@
           <w:szCs w:val="26"/>
         </w:rPr>
         <w:drawing>
-          <wp:inline distT="0" distB="0" distL="0" distR="0" wp14:anchorId="36AE4EAA" wp14:editId="6CAA093D">
-            <wp:extent cx="6123305" cy="4328160"/>
+          <wp:inline distT="0" distB="0" distL="0" distR="0" wp14:anchorId="36AE4EAA" wp14:editId="75FE1137">
+            <wp:extent cx="5887411" cy="4161422"/>
             <wp:effectExtent l="0" t="0" r="0" b="0"/>
             <wp:docPr id="17" name="Picture 17"/>
             <wp:cNvGraphicFramePr>
@@ -30089,7 +30326,7 @@
                   <pic:spPr>
                     <a:xfrm>
                       <a:off x="0" y="0"/>
-                      <a:ext cx="6123305" cy="4328160"/>
+                      <a:ext cx="5903716" cy="4172947"/>
                     </a:xfrm>
                     <a:prstGeom prst="rect">
                       <a:avLst/>
@@ -30231,7 +30468,7 @@
         <w:pStyle w:val="Heading5"/>
         <w:spacing w:line="360" w:lineRule="auto"/>
       </w:pPr>
-      <w:bookmarkStart w:id="112" w:name="_Toc232624561"/>
+      <w:bookmarkStart w:id="112" w:name="_Toc232625697"/>
       <w:r>
         <w:rPr>
           <w:lang w:val="en-US"/>
@@ -30542,7 +30779,7 @@
         <w:pStyle w:val="Heading5"/>
         <w:spacing w:line="360" w:lineRule="auto"/>
       </w:pPr>
-      <w:bookmarkStart w:id="114" w:name="_Toc232624562"/>
+      <w:bookmarkStart w:id="114" w:name="_Toc232625698"/>
       <w:r>
         <w:rPr>
           <w:lang w:val="en-US"/>
@@ -30967,7 +31204,7 @@
           <w:lang w:val="en-US"/>
         </w:rPr>
       </w:pPr>
-      <w:bookmarkStart w:id="116" w:name="_Toc232624563"/>
+      <w:bookmarkStart w:id="116" w:name="_Toc232625699"/>
       <w:r>
         <w:rPr>
           <w:lang w:val="en-US"/>
@@ -31276,6 +31513,7 @@
         <w:autoSpaceDE/>
         <w:autoSpaceDN/>
         <w:spacing w:before="100" w:beforeAutospacing="1" w:after="100" w:afterAutospacing="1" w:line="360" w:lineRule="auto"/>
+        <w:jc w:val="center"/>
         <w:rPr>
           <w:sz w:val="26"/>
           <w:szCs w:val="26"/>
@@ -31288,11 +31526,10 @@
           <w:szCs w:val="26"/>
           <w:lang w:val="en-US"/>
         </w:rPr>
-        <w:lastRenderedPageBreak/>
         <w:drawing>
-          <wp:inline distT="0" distB="0" distL="0" distR="0" wp14:anchorId="1D539743" wp14:editId="07D01972">
-            <wp:extent cx="6123305" cy="4479925"/>
-            <wp:effectExtent l="0" t="0" r="0" b="0"/>
+          <wp:inline distT="0" distB="0" distL="0" distR="0" wp14:anchorId="1D539743" wp14:editId="422F1D2C">
+            <wp:extent cx="5432188" cy="3974291"/>
+            <wp:effectExtent l="0" t="0" r="0" b="7620"/>
             <wp:docPr id="28" name="Picture 28"/>
             <wp:cNvGraphicFramePr>
               <a:graphicFrameLocks xmlns:a="http://schemas.openxmlformats.org/drawingml/2006/main" noChangeAspect="1"/>
@@ -31319,7 +31556,7 @@
                   <pic:spPr>
                     <a:xfrm>
                       <a:off x="0" y="0"/>
-                      <a:ext cx="6123305" cy="4479925"/>
+                      <a:ext cx="5446271" cy="3984594"/>
                     </a:xfrm>
                     <a:prstGeom prst="rect">
                       <a:avLst/>
@@ -31476,6 +31713,7 @@
           <w:szCs w:val="26"/>
           <w:lang w:val="en-US"/>
         </w:rPr>
+        <w:lastRenderedPageBreak/>
         <w:t>Mời người dùng</w:t>
       </w:r>
     </w:p>
@@ -31519,7 +31757,6 @@
           <w:szCs w:val="26"/>
           <w:lang w:val="en-US"/>
         </w:rPr>
-        <w:lastRenderedPageBreak/>
         <w:drawing>
           <wp:inline distT="0" distB="0" distL="0" distR="0" wp14:anchorId="19E7B598" wp14:editId="31D58560">
             <wp:extent cx="3942608" cy="5651939"/>
@@ -31798,6 +32035,7 @@
           <w:szCs w:val="26"/>
           <w:lang w:val="en-US"/>
         </w:rPr>
+        <w:lastRenderedPageBreak/>
         <w:t xml:space="preserve">        ArrayList&lt;ClientHandler&gt;&gt; groups</w:t>
       </w:r>
     </w:p>
@@ -31844,7 +32082,6 @@
           <w:szCs w:val="26"/>
           <w:lang w:val="en-US"/>
         </w:rPr>
-        <w:lastRenderedPageBreak/>
         <w:t xml:space="preserve">Key: tên nhóm. </w:t>
       </w:r>
     </w:p>
@@ -31963,6 +32200,7 @@
               <w:autoSpaceDE/>
               <w:autoSpaceDN/>
               <w:spacing w:before="100" w:beforeAutospacing="1" w:after="100" w:afterAutospacing="1" w:line="360" w:lineRule="auto"/>
+              <w:jc w:val="center"/>
               <w:rPr>
                 <w:sz w:val="26"/>
                 <w:szCs w:val="26"/>
@@ -31976,9 +32214,9 @@
               </w:rPr>
               <w:lastRenderedPageBreak/>
               <w:drawing>
-                <wp:inline distT="0" distB="0" distL="0" distR="0" wp14:anchorId="6B89D253" wp14:editId="74AAA153">
-                  <wp:extent cx="6146481" cy="4393870"/>
-                  <wp:effectExtent l="0" t="0" r="6985" b="6985"/>
+                <wp:inline distT="0" distB="0" distL="0" distR="0" wp14:anchorId="6B89D253" wp14:editId="3C4795B8">
+                  <wp:extent cx="4491839" cy="3211033"/>
+                  <wp:effectExtent l="0" t="0" r="4445" b="8890"/>
                   <wp:docPr id="31" name="Picture 31"/>
                   <wp:cNvGraphicFramePr>
                     <a:graphicFrameLocks xmlns:a="http://schemas.openxmlformats.org/drawingml/2006/main" noChangeAspect="1"/>
@@ -32005,7 +32243,7 @@
                         <pic:spPr>
                           <a:xfrm>
                             <a:off x="0" y="0"/>
-                            <a:ext cx="6161246" cy="4404425"/>
+                            <a:ext cx="4519125" cy="3230539"/>
                           </a:xfrm>
                           <a:prstGeom prst="rect">
                             <a:avLst/>
@@ -32157,6 +32395,7 @@
               <w:autoSpaceDE/>
               <w:autoSpaceDN/>
               <w:spacing w:before="100" w:beforeAutospacing="1" w:after="100" w:afterAutospacing="1" w:line="360" w:lineRule="auto"/>
+              <w:jc w:val="center"/>
               <w:rPr>
                 <w:sz w:val="26"/>
                 <w:szCs w:val="26"/>
@@ -32170,9 +32409,9 @@
               </w:rPr>
               <w:lastRenderedPageBreak/>
               <w:drawing>
-                <wp:inline distT="0" distB="0" distL="0" distR="0" wp14:anchorId="1A7451A6" wp14:editId="425C9169">
-                  <wp:extent cx="6140450" cy="6768935"/>
-                  <wp:effectExtent l="0" t="0" r="0" b="0"/>
+                <wp:inline distT="0" distB="0" distL="0" distR="0" wp14:anchorId="1A7451A6" wp14:editId="787B8A76">
+                  <wp:extent cx="6028340" cy="6645349"/>
+                  <wp:effectExtent l="0" t="0" r="0" b="3175"/>
                   <wp:docPr id="32" name="Picture 32"/>
                   <wp:cNvGraphicFramePr>
                     <a:graphicFrameLocks xmlns:a="http://schemas.openxmlformats.org/drawingml/2006/main" noChangeAspect="1"/>
@@ -32199,7 +32438,7 @@
                         <pic:spPr>
                           <a:xfrm>
                             <a:off x="0" y="0"/>
-                            <a:ext cx="6174696" cy="6806686"/>
+                            <a:ext cx="6089387" cy="6712644"/>
                           </a:xfrm>
                           <a:prstGeom prst="rect">
                             <a:avLst/>
@@ -32361,7 +32600,7 @@
           <w:lang w:val="en-US"/>
         </w:rPr>
       </w:pPr>
-      <w:bookmarkStart w:id="122" w:name="_Toc232624564"/>
+      <w:bookmarkStart w:id="122" w:name="_Toc232625700"/>
       <w:r>
         <w:rPr>
           <w:lang w:val="en-US"/>
@@ -32514,7 +32753,6 @@
                 <w:szCs w:val="26"/>
                 <w:lang w:val="en-US"/>
               </w:rPr>
-              <w:lastRenderedPageBreak/>
               <w:t>/pm</w:t>
             </w:r>
           </w:p>
@@ -32569,6 +32807,7 @@
                 <w:szCs w:val="26"/>
                 <w:lang w:val="en-US"/>
               </w:rPr>
+              <w:lastRenderedPageBreak/>
               <w:t>/creategroup</w:t>
             </w:r>
           </w:p>
@@ -32998,7 +33237,7 @@
           <w:lang w:val="en-US"/>
         </w:rPr>
       </w:pPr>
-      <w:bookmarkStart w:id="124" w:name="_Toc232624565"/>
+      <w:bookmarkStart w:id="124" w:name="_Toc232625701"/>
       <w:r>
         <w:rPr>
           <w:lang w:val="en-US"/>
@@ -33377,7 +33616,7 @@
           <w:szCs w:val="26"/>
         </w:rPr>
       </w:pPr>
-      <w:bookmarkStart w:id="125" w:name="_Toc232624566"/>
+      <w:bookmarkStart w:id="125" w:name="_Toc232625702"/>
       <w:r>
         <w:rPr>
           <w:rFonts w:asciiTheme="majorHAnsi" w:hAnsiTheme="majorHAnsi" w:cstheme="majorHAnsi"/>
@@ -33389,7 +33628,7 @@
         <mc:AlternateContent>
           <mc:Choice Requires="wps">
             <w:drawing>
-              <wp:anchor distT="0" distB="0" distL="0" distR="0" simplePos="0" relativeHeight="251659264" behindDoc="1" locked="0" layoutInCell="1" allowOverlap="1" wp14:anchorId="38F0A1BF" wp14:editId="0279F40F">
+              <wp:anchor distT="0" distB="0" distL="0" distR="0" simplePos="0" relativeHeight="251659776" behindDoc="1" locked="0" layoutInCell="1" allowOverlap="1" wp14:anchorId="38F0A1BF" wp14:editId="0279F40F">
                 <wp:simplePos x="0" y="0"/>
                 <wp:positionH relativeFrom="page">
                   <wp:posOffset>900000</wp:posOffset>
@@ -33460,7 +33699,7 @@
           </mc:Choice>
           <mc:Fallback>
             <w:pict>
-              <v:shape w14:anchorId="42EBCBF3" id="Graphic 15" o:spid="_x0000_s1026" style="position:absolute;margin-left:70.85pt;margin-top:25.95pt;width:467.75pt;height:.75pt;z-index:-251657216;visibility:visible;mso-wrap-style:square;mso-wrap-distance-left:0;mso-wrap-distance-top:0;mso-wrap-distance-right:0;mso-wrap-distance-bottom:0;mso-position-horizontal:absolute;mso-position-horizontal-relative:page;mso-position-vertical:absolute;mso-position-vertical-relative:text;v-text-anchor:top" coordsize="5940425,9525" o:gfxdata="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" path="m5940000,9525l,9525,,,5940000,r,9525xe" fillcolor="#333" stroked="f">
+              <v:shape w14:anchorId="5F2E2505" id="Graphic 15" o:spid="_x0000_s1026" style="position:absolute;margin-left:70.85pt;margin-top:25.95pt;width:467.75pt;height:.75pt;z-index:-251656704;visibility:visible;mso-wrap-style:square;mso-wrap-distance-left:0;mso-wrap-distance-top:0;mso-wrap-distance-right:0;mso-wrap-distance-bottom:0;mso-position-horizontal:absolute;mso-position-horizontal-relative:page;mso-position-vertical:absolute;mso-position-vertical-relative:text;v-text-anchor:top" coordsize="5940425,9525" o:gfxdata="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" path="m5940000,9525l,9525,,,5940000,r,9525xe" fillcolor="#333" stroked="f">
                 <v:path arrowok="t"/>
                 <w10:wrap type="topAndBottom" anchorx="page"/>
               </v:shape>
@@ -33525,7 +33764,7 @@
         <w:pStyle w:val="Heading5"/>
         <w:spacing w:line="360" w:lineRule="auto"/>
       </w:pPr>
-      <w:bookmarkStart w:id="126" w:name="_Toc232624567"/>
+      <w:bookmarkStart w:id="126" w:name="_Toc232625703"/>
       <w:r>
         <w:t>5.1 KẾT LUẬN</w:t>
       </w:r>
@@ -33580,7 +33819,7 @@
           <w:szCs w:val="26"/>
         </w:rPr>
       </w:pPr>
-      <w:bookmarkStart w:id="127" w:name="_Toc232624568"/>
+      <w:bookmarkStart w:id="127" w:name="_Toc232625704"/>
       <w:r>
         <w:rPr>
           <w:sz w:val="26"/>
@@ -33805,7 +34044,7 @@
           <w:szCs w:val="26"/>
         </w:rPr>
       </w:pPr>
-      <w:bookmarkStart w:id="128" w:name="_Toc232624569"/>
+      <w:bookmarkStart w:id="128" w:name="_Toc232625705"/>
       <w:r>
         <w:rPr>
           <w:sz w:val="26"/>
@@ -34220,7 +34459,7 @@
         <w:pStyle w:val="Heading5"/>
         <w:spacing w:line="360" w:lineRule="auto"/>
       </w:pPr>
-      <w:bookmarkStart w:id="129" w:name="_Toc232624570"/>
+      <w:bookmarkStart w:id="129" w:name="_Toc232625706"/>
       <w:r>
         <w:t>5.2 HẠN CHẾ CỦA HỆ THỐNG</w:t>
       </w:r>
@@ -34256,7 +34495,7 @@
           <w:szCs w:val="26"/>
         </w:rPr>
       </w:pPr>
-      <w:bookmarkStart w:id="130" w:name="_Toc232624571"/>
+      <w:bookmarkStart w:id="130" w:name="_Toc232625707"/>
       <w:r>
         <w:rPr>
           <w:sz w:val="26"/>
@@ -34291,7 +34530,7 @@
           <w:szCs w:val="26"/>
         </w:rPr>
       </w:pPr>
-      <w:bookmarkStart w:id="131" w:name="_Toc232624572"/>
+      <w:bookmarkStart w:id="131" w:name="_Toc232625708"/>
       <w:r>
         <w:rPr>
           <w:sz w:val="26"/>
@@ -34339,7 +34578,7 @@
           <w:szCs w:val="26"/>
         </w:rPr>
       </w:pPr>
-      <w:bookmarkStart w:id="132" w:name="_Toc232624573"/>
+      <w:bookmarkStart w:id="132" w:name="_Toc232625709"/>
       <w:r>
         <w:rPr>
           <w:sz w:val="26"/>
@@ -34387,7 +34626,7 @@
           <w:szCs w:val="26"/>
         </w:rPr>
       </w:pPr>
-      <w:bookmarkStart w:id="133" w:name="_Toc232624574"/>
+      <w:bookmarkStart w:id="133" w:name="_Toc232625710"/>
       <w:r>
         <w:rPr>
           <w:rFonts w:hAnsi="Symbol"/>
@@ -34476,7 +34715,7 @@
           <w:szCs w:val="26"/>
         </w:rPr>
       </w:pPr>
-      <w:bookmarkStart w:id="134" w:name="_Toc232624575"/>
+      <w:bookmarkStart w:id="134" w:name="_Toc232625711"/>
       <w:r>
         <w:rPr>
           <w:sz w:val="26"/>
@@ -34522,7 +34761,7 @@
           <w:lang w:val="en-US"/>
         </w:rPr>
       </w:pPr>
-      <w:bookmarkStart w:id="135" w:name="_Toc232624576"/>
+      <w:bookmarkStart w:id="135" w:name="_Toc232625712"/>
       <w:r>
         <w:t>5.3 HƯỚNG PHÁT TRIỂN CỦA ĐỀ TÀI</w:t>
       </w:r>
@@ -34558,7 +34797,7 @@
           <w:szCs w:val="26"/>
         </w:rPr>
       </w:pPr>
-      <w:bookmarkStart w:id="136" w:name="_Toc232624577"/>
+      <w:bookmarkStart w:id="136" w:name="_Toc232625713"/>
       <w:r>
         <w:rPr>
           <w:sz w:val="26"/>
@@ -34595,7 +34834,7 @@
           <w:szCs w:val="26"/>
         </w:rPr>
       </w:pPr>
-      <w:bookmarkStart w:id="137" w:name="_Toc232624578"/>
+      <w:bookmarkStart w:id="137" w:name="_Toc232625714"/>
       <w:r>
         <w:rPr>
           <w:sz w:val="26"/>
@@ -34634,7 +34873,7 @@
           <w:szCs w:val="26"/>
         </w:rPr>
       </w:pPr>
-      <w:bookmarkStart w:id="138" w:name="_Toc232624579"/>
+      <w:bookmarkStart w:id="138" w:name="_Toc232625715"/>
       <w:r>
         <w:rPr>
           <w:sz w:val="26"/>
@@ -34671,7 +34910,7 @@
           <w:szCs w:val="26"/>
         </w:rPr>
       </w:pPr>
-      <w:bookmarkStart w:id="139" w:name="_Toc232624580"/>
+      <w:bookmarkStart w:id="139" w:name="_Toc232625716"/>
       <w:r>
         <w:rPr>
           <w:sz w:val="26"/>
@@ -34731,7 +34970,7 @@
           <w:szCs w:val="26"/>
         </w:rPr>
       </w:pPr>
-      <w:bookmarkStart w:id="140" w:name="_Toc232624581"/>
+      <w:bookmarkStart w:id="140" w:name="_Toc232625717"/>
       <w:r>
         <w:rPr>
           <w:sz w:val="26"/>
@@ -34773,7 +35012,7 @@
           <w:lang w:val="en-US"/>
         </w:rPr>
       </w:pPr>
-      <w:bookmarkStart w:id="141" w:name="_Toc232624582"/>
+      <w:bookmarkStart w:id="141" w:name="_Toc232625718"/>
       <w:r>
         <w:rPr>
           <w:sz w:val="26"/>
@@ -34791,6 +35030,7 @@
           <w:lang w:val="en-US"/>
         </w:rPr>
       </w:pPr>
+      <w:bookmarkStart w:id="142" w:name="_Toc232625719"/>
       <w:r>
         <w:rPr>
           <w:lang w:val="en-US"/>
@@ -34800,6 +35040,7 @@
       <w:r>
         <w:t>. Tài liệu tiếng Việt</w:t>
       </w:r>
+      <w:bookmarkEnd w:id="142"/>
     </w:p>
     <w:p>
       <w:pPr>
@@ -34882,6 +35123,7 @@
           <w:lang w:val="en-US"/>
         </w:rPr>
       </w:pPr>
+      <w:bookmarkStart w:id="143" w:name="_Toc232625720"/>
       <w:r>
         <w:rPr>
           <w:lang w:val="en-US"/>
@@ -34892,6 +35134,7 @@
       <w:r>
         <w:t>. Tài liệu tiếng Anh (Tài liệu quốc tế)</w:t>
       </w:r>
+      <w:bookmarkEnd w:id="143"/>
     </w:p>
     <w:p>
       <w:pPr>
@@ -35028,6 +35271,7 @@
       <w:pPr>
         <w:pStyle w:val="Heading4"/>
       </w:pPr>
+      <w:bookmarkStart w:id="144" w:name="_Toc232625721"/>
       <w:r>
         <w:rPr>
           <w:lang w:val="en-US"/>
@@ -35037,6 +35281,7 @@
       <w:r>
         <w:t>Một số trang Web hướng dẫn thực hiện ứng dụng tham khảo:</w:t>
       </w:r>
+      <w:bookmarkEnd w:id="144"/>
     </w:p>
     <w:p>
       <w:pPr>
@@ -35193,7 +35438,7 @@
           <w:lang w:val="en-US"/>
         </w:rPr>
       </w:pPr>
-      <w:bookmarkStart w:id="142" w:name="_Toc232624583"/>
+      <w:bookmarkStart w:id="145" w:name="_Toc232625722"/>
       <w:r>
         <w:rPr>
           <w:sz w:val="26"/>
@@ -35202,7 +35447,7 @@
         </w:rPr>
         <w:t>PHỤ LỤC</w:t>
       </w:r>
-      <w:bookmarkEnd w:id="142"/>
+      <w:bookmarkEnd w:id="145"/>
     </w:p>
     <w:p>
       <w:pPr>
@@ -35212,7 +35457,7 @@
           <w:lang w:val="en-US"/>
         </w:rPr>
       </w:pPr>
-      <w:bookmarkStart w:id="143" w:name="_Toc232624584"/>
+      <w:bookmarkStart w:id="146" w:name="_Toc232625723"/>
       <w:r>
         <w:rPr>
           <w:lang w:val="en-US"/>
@@ -35239,7 +35484,7 @@
           </w:rPr>
           <w:t>https://github.com/trungnt2026/build_chat_official</w:t>
         </w:r>
-        <w:bookmarkEnd w:id="143"/>
+        <w:bookmarkEnd w:id="146"/>
       </w:hyperlink>
     </w:p>
     <w:p>
@@ -35249,7 +35494,7 @@
           <w:lang w:val="en-US"/>
         </w:rPr>
       </w:pPr>
-      <w:bookmarkStart w:id="144" w:name="_Toc232624585"/>
+      <w:bookmarkStart w:id="147" w:name="_Toc232625724"/>
       <w:r>
         <w:rPr>
           <w:rStyle w:val="Hyperlink"/>
@@ -35268,7 +35513,7 @@
         </w:rPr>
         <w:t xml:space="preserve"> và thực thi mã nguồn</w:t>
       </w:r>
-      <w:bookmarkEnd w:id="144"/>
+      <w:bookmarkEnd w:id="147"/>
     </w:p>
     <w:sectPr>
       <w:pgSz w:w="11910" w:h="16840" w:code="9"/>
@@ -35618,7 +35863,7 @@
         <v:path o:extrusionok="f" gradientshapeok="t" o:connecttype="rect"/>
         <o:lock v:ext="edit" aspectratio="t"/>
       </v:shapetype>
-      <v:shape id="_x0000_i4265" type="#_x0000_t75" style="width:11.2pt;height:11.2pt" o:bullet="t">
+      <v:shape id="_x0000_i4353" type="#_x0000_t75" style="width:11.2pt;height:11.2pt" o:bullet="t">
         <v:imagedata r:id="rId1" o:title="msoCBAC"/>
       </v:shape>
     </w:pict>

</xml_diff>